<commit_message>
docs: reconcile reported cost with actual bills (total 2.59 CNY, dual-caliber)
Bill-caliber audit: deepseek 1.30 + qwen 1.29 CNY across all runs vs
4.36 CNY list-price estimate. Fixed remaining stale figures on cover
page, C4 contribution, HTML conclusion (incl. 1/5 -> 1/8 budget ratio),
added billing-caliber robustness recheck for H4. Added cost_recheck.py
(allocation script) and secret_scan.py (pre-open-source key scan).
</commit_message>
<xml_diff>
--- a/report/evalbench-course-paper/EvalBench课程论文.docx
+++ b/report/evalbench-course-paper/EvalBench课程论文.docx
@@ -306,13 +306,19 @@
         <w:t xml:space="preserve">API </w:t>
       </w:r>
       <w:r>
-        <w:t>总成本：约</w:t>
-      </w:r>
-      <w:r>
-        <w:t xml:space="preserve"> ¥4.4</w:t>
-      </w:r>
-      <w:r>
-        <w:t>（预算熔断线</w:t>
+        <w:t>总成本：账单实测</w:t>
+      </w:r>
+      <w:r>
+        <w:t xml:space="preserve"> ¥2.59</w:t>
+      </w:r>
+      <w:r>
+        <w:t>（牌价折算</w:t>
+      </w:r>
+      <w:r>
+        <w:t xml:space="preserve"> ¥4.36</w:t>
+      </w:r>
+      <w:r>
+        <w:t>；预算熔断线</w:t>
       </w:r>
       <w:r>
         <w:t xml:space="preserve"> ¥50</w:t>
@@ -438,7 +444,7 @@
     <w:sdt>
       <w:sdtPr>
         <w:alias w:val="TOC"/>
-        <w:id w:val="-1263220333"/>
+        <w:id w:val="-1781950322"/>
       </w:sdtPr>
       <w:sdtEndPr/>
       <w:sdtContent>
@@ -465,7 +471,7 @@
           <w:r>
             <w:fldChar w:fldCharType="separate"/>
           </w:r>
-          <w:hyperlink w:anchor="_Toc242176752" w:history="1">
+          <w:hyperlink w:anchor="_Toc242208861" w:history="1">
             <w:r>
               <w:rPr>
                 <w:rStyle w:val="a5"/>
@@ -499,7 +505,7 @@
               <w:rPr>
                 <w:noProof/>
               </w:rPr>
-              <w:instrText>PAGEREF _Toc242176752 \h</w:instrText>
+              <w:instrText>PAGEREF _Toc242208861 \h</w:instrText>
             </w:r>
             <w:r>
               <w:rPr>
@@ -550,7 +556,7 @@
               <w14:ligatures w14:val="standardContextual"/>
             </w:rPr>
           </w:pPr>
-          <w:hyperlink w:anchor="_Toc242176753" w:history="1">
+          <w:hyperlink w:anchor="_Toc242208862" w:history="1">
             <w:r>
               <w:rPr>
                 <w:rStyle w:val="a5"/>
@@ -592,7 +598,7 @@
               <w:rPr>
                 <w:noProof/>
               </w:rPr>
-              <w:instrText>PAGEREF _Toc242176753 \h</w:instrText>
+              <w:instrText>PAGEREF _Toc242208862 \h</w:instrText>
             </w:r>
             <w:r>
               <w:rPr>
@@ -644,7 +650,7 @@
               <w14:ligatures w14:val="standardContextual"/>
             </w:rPr>
           </w:pPr>
-          <w:hyperlink w:anchor="_Toc242176754" w:history="1">
+          <w:hyperlink w:anchor="_Toc242208863" w:history="1">
             <w:r>
               <w:rPr>
                 <w:rStyle w:val="a5"/>
@@ -686,7 +692,7 @@
               <w:rPr>
                 <w:noProof/>
               </w:rPr>
-              <w:instrText>PAGEREF _Toc242176754 \h</w:instrText>
+              <w:instrText>PAGEREF _Toc242208863 \h</w:instrText>
             </w:r>
             <w:r>
               <w:rPr>
@@ -738,7 +744,7 @@
               <w14:ligatures w14:val="standardContextual"/>
             </w:rPr>
           </w:pPr>
-          <w:hyperlink w:anchor="_Toc242176755" w:history="1">
+          <w:hyperlink w:anchor="_Toc242208864" w:history="1">
             <w:r>
               <w:rPr>
                 <w:rStyle w:val="a5"/>
@@ -780,7 +786,7 @@
               <w:rPr>
                 <w:noProof/>
               </w:rPr>
-              <w:instrText>PAGEREF _Toc242176755 \h</w:instrText>
+              <w:instrText>PAGEREF _Toc242208864 \h</w:instrText>
             </w:r>
             <w:r>
               <w:rPr>
@@ -832,7 +838,7 @@
               <w14:ligatures w14:val="standardContextual"/>
             </w:rPr>
           </w:pPr>
-          <w:hyperlink w:anchor="_Toc242176756" w:history="1">
+          <w:hyperlink w:anchor="_Toc242208865" w:history="1">
             <w:r>
               <w:rPr>
                 <w:rStyle w:val="a5"/>
@@ -874,7 +880,7 @@
               <w:rPr>
                 <w:noProof/>
               </w:rPr>
-              <w:instrText>PAGEREF _Toc242176756 \h</w:instrText>
+              <w:instrText>PAGEREF _Toc242208865 \h</w:instrText>
             </w:r>
             <w:r>
               <w:rPr>
@@ -925,7 +931,7 @@
               <w14:ligatures w14:val="standardContextual"/>
             </w:rPr>
           </w:pPr>
-          <w:hyperlink w:anchor="_Toc242176757" w:history="1">
+          <w:hyperlink w:anchor="_Toc242208866" w:history="1">
             <w:r>
               <w:rPr>
                 <w:rStyle w:val="a5"/>
@@ -967,7 +973,7 @@
               <w:rPr>
                 <w:noProof/>
               </w:rPr>
-              <w:instrText>PAGEREF _Toc242176757 \h</w:instrText>
+              <w:instrText>PAGEREF _Toc242208866 \h</w:instrText>
             </w:r>
             <w:r>
               <w:rPr>
@@ -1019,7 +1025,7 @@
               <w14:ligatures w14:val="standardContextual"/>
             </w:rPr>
           </w:pPr>
-          <w:hyperlink w:anchor="_Toc242176758" w:history="1">
+          <w:hyperlink w:anchor="_Toc242208867" w:history="1">
             <w:r>
               <w:rPr>
                 <w:rStyle w:val="a5"/>
@@ -1061,7 +1067,7 @@
               <w:rPr>
                 <w:noProof/>
               </w:rPr>
-              <w:instrText>PAGEREF _Toc242176758 \h</w:instrText>
+              <w:instrText>PAGEREF _Toc242208867 \h</w:instrText>
             </w:r>
             <w:r>
               <w:rPr>
@@ -1113,7 +1119,7 @@
               <w14:ligatures w14:val="standardContextual"/>
             </w:rPr>
           </w:pPr>
-          <w:hyperlink w:anchor="_Toc242176759" w:history="1">
+          <w:hyperlink w:anchor="_Toc242208868" w:history="1">
             <w:r>
               <w:rPr>
                 <w:rStyle w:val="a5"/>
@@ -1155,7 +1161,7 @@
               <w:rPr>
                 <w:noProof/>
               </w:rPr>
-              <w:instrText>PAGEREF _Toc242176759 \h</w:instrText>
+              <w:instrText>PAGEREF _Toc242208868 \h</w:instrText>
             </w:r>
             <w:r>
               <w:rPr>
@@ -1206,7 +1212,7 @@
               <w14:ligatures w14:val="standardContextual"/>
             </w:rPr>
           </w:pPr>
-          <w:hyperlink w:anchor="_Toc242176760" w:history="1">
+          <w:hyperlink w:anchor="_Toc242208869" w:history="1">
             <w:r>
               <w:rPr>
                 <w:rStyle w:val="a5"/>
@@ -1264,7 +1270,7 @@
               <w:rPr>
                 <w:noProof/>
               </w:rPr>
-              <w:instrText>PAGEREF _Toc242176760 \h</w:instrText>
+              <w:instrText>PAGEREF _Toc242208869 \h</w:instrText>
             </w:r>
             <w:r>
               <w:rPr>
@@ -1316,7 +1322,7 @@
               <w14:ligatures w14:val="standardContextual"/>
             </w:rPr>
           </w:pPr>
-          <w:hyperlink w:anchor="_Toc242176761" w:history="1">
+          <w:hyperlink w:anchor="_Toc242208870" w:history="1">
             <w:r>
               <w:rPr>
                 <w:rStyle w:val="a5"/>
@@ -1358,7 +1364,7 @@
               <w:rPr>
                 <w:noProof/>
               </w:rPr>
-              <w:instrText>PAGEREF _Toc242176761 \h</w:instrText>
+              <w:instrText>PAGEREF _Toc242208870 \h</w:instrText>
             </w:r>
             <w:r>
               <w:rPr>
@@ -1410,7 +1416,7 @@
               <w14:ligatures w14:val="standardContextual"/>
             </w:rPr>
           </w:pPr>
-          <w:hyperlink w:anchor="_Toc242176762" w:history="1">
+          <w:hyperlink w:anchor="_Toc242208871" w:history="1">
             <w:r>
               <w:rPr>
                 <w:rStyle w:val="a5"/>
@@ -1484,7 +1490,7 @@
               <w:rPr>
                 <w:noProof/>
               </w:rPr>
-              <w:instrText>PAGEREF _Toc242176762 \h</w:instrText>
+              <w:instrText>PAGEREF _Toc242208871 \h</w:instrText>
             </w:r>
             <w:r>
               <w:rPr>
@@ -1536,7 +1542,7 @@
               <w14:ligatures w14:val="standardContextual"/>
             </w:rPr>
           </w:pPr>
-          <w:hyperlink w:anchor="_Toc242176763" w:history="1">
+          <w:hyperlink w:anchor="_Toc242208872" w:history="1">
             <w:r>
               <w:rPr>
                 <w:rStyle w:val="a5"/>
@@ -1594,7 +1600,7 @@
               <w:rPr>
                 <w:noProof/>
               </w:rPr>
-              <w:instrText>PAGEREF _Toc242176763 \h</w:instrText>
+              <w:instrText>PAGEREF _Toc242208872 \h</w:instrText>
             </w:r>
             <w:r>
               <w:rPr>
@@ -1646,7 +1652,7 @@
               <w14:ligatures w14:val="standardContextual"/>
             </w:rPr>
           </w:pPr>
-          <w:hyperlink w:anchor="_Toc242176764" w:history="1">
+          <w:hyperlink w:anchor="_Toc242208873" w:history="1">
             <w:r>
               <w:rPr>
                 <w:rStyle w:val="a5"/>
@@ -1704,7 +1710,7 @@
               <w:rPr>
                 <w:noProof/>
               </w:rPr>
-              <w:instrText>PAGEREF _Toc242176764 \h</w:instrText>
+              <w:instrText>PAGEREF _Toc242208873 \h</w:instrText>
             </w:r>
             <w:r>
               <w:rPr>
@@ -1730,7 +1736,7 @@
               <w:rPr>
                 <w:noProof/>
               </w:rPr>
-              <w:t>13</w:t>
+              <w:t>14</w:t>
             </w:r>
             <w:r>
               <w:rPr>
@@ -1756,7 +1762,7 @@
               <w14:ligatures w14:val="standardContextual"/>
             </w:rPr>
           </w:pPr>
-          <w:hyperlink w:anchor="_Toc242176765" w:history="1">
+          <w:hyperlink w:anchor="_Toc242208874" w:history="1">
             <w:r>
               <w:rPr>
                 <w:rStyle w:val="a5"/>
@@ -1814,7 +1820,7 @@
               <w:rPr>
                 <w:noProof/>
               </w:rPr>
-              <w:instrText>PAGEREF _Toc242176765 \h</w:instrText>
+              <w:instrText>PAGEREF _Toc242208874 \h</w:instrText>
             </w:r>
             <w:r>
               <w:rPr>
@@ -1865,7 +1871,7 @@
               <w14:ligatures w14:val="standardContextual"/>
             </w:rPr>
           </w:pPr>
-          <w:hyperlink w:anchor="_Toc242176766" w:history="1">
+          <w:hyperlink w:anchor="_Toc242208875" w:history="1">
             <w:r>
               <w:rPr>
                 <w:rStyle w:val="a5"/>
@@ -1907,7 +1913,7 @@
               <w:rPr>
                 <w:noProof/>
               </w:rPr>
-              <w:instrText>PAGEREF _Toc242176766 \h</w:instrText>
+              <w:instrText>PAGEREF _Toc242208875 \h</w:instrText>
             </w:r>
             <w:r>
               <w:rPr>
@@ -1959,7 +1965,7 @@
               <w14:ligatures w14:val="standardContextual"/>
             </w:rPr>
           </w:pPr>
-          <w:hyperlink w:anchor="_Toc242176767" w:history="1">
+          <w:hyperlink w:anchor="_Toc242208876" w:history="1">
             <w:r>
               <w:rPr>
                 <w:rStyle w:val="a5"/>
@@ -2001,7 +2007,7 @@
               <w:rPr>
                 <w:noProof/>
               </w:rPr>
-              <w:instrText>PAGEREF _Toc242176767 \h</w:instrText>
+              <w:instrText>PAGEREF _Toc242208876 \h</w:instrText>
             </w:r>
             <w:r>
               <w:rPr>
@@ -2053,7 +2059,7 @@
               <w14:ligatures w14:val="standardContextual"/>
             </w:rPr>
           </w:pPr>
-          <w:hyperlink w:anchor="_Toc242176768" w:history="1">
+          <w:hyperlink w:anchor="_Toc242208877" w:history="1">
             <w:r>
               <w:rPr>
                 <w:rStyle w:val="a5"/>
@@ -2095,7 +2101,7 @@
               <w:rPr>
                 <w:noProof/>
               </w:rPr>
-              <w:instrText>PAGEREF _Toc242176768 \h</w:instrText>
+              <w:instrText>PAGEREF _Toc242208877 \h</w:instrText>
             </w:r>
             <w:r>
               <w:rPr>
@@ -2147,7 +2153,7 @@
               <w14:ligatures w14:val="standardContextual"/>
             </w:rPr>
           </w:pPr>
-          <w:hyperlink w:anchor="_Toc242176769" w:history="1">
+          <w:hyperlink w:anchor="_Toc242208878" w:history="1">
             <w:r>
               <w:rPr>
                 <w:rStyle w:val="a5"/>
@@ -2189,7 +2195,7 @@
               <w:rPr>
                 <w:noProof/>
               </w:rPr>
-              <w:instrText>PAGEREF _Toc242176769 \h</w:instrText>
+              <w:instrText>PAGEREF _Toc242208878 \h</w:instrText>
             </w:r>
             <w:r>
               <w:rPr>
@@ -2240,7 +2246,7 @@
               <w14:ligatures w14:val="standardContextual"/>
             </w:rPr>
           </w:pPr>
-          <w:hyperlink w:anchor="_Toc242176770" w:history="1">
+          <w:hyperlink w:anchor="_Toc242208879" w:history="1">
             <w:r>
               <w:rPr>
                 <w:rStyle w:val="a5"/>
@@ -2282,7 +2288,7 @@
               <w:rPr>
                 <w:noProof/>
               </w:rPr>
-              <w:instrText>PAGEREF _Toc242176770 \h</w:instrText>
+              <w:instrText>PAGEREF _Toc242208879 \h</w:instrText>
             </w:r>
             <w:r>
               <w:rPr>
@@ -2334,7 +2340,7 @@
               <w14:ligatures w14:val="standardContextual"/>
             </w:rPr>
           </w:pPr>
-          <w:hyperlink w:anchor="_Toc242176771" w:history="1">
+          <w:hyperlink w:anchor="_Toc242208880" w:history="1">
             <w:r>
               <w:rPr>
                 <w:rStyle w:val="a5"/>
@@ -2376,7 +2382,7 @@
               <w:rPr>
                 <w:noProof/>
               </w:rPr>
-              <w:instrText>PAGEREF _Toc242176771 \h</w:instrText>
+              <w:instrText>PAGEREF _Toc242208880 \h</w:instrText>
             </w:r>
             <w:r>
               <w:rPr>
@@ -2428,7 +2434,7 @@
               <w14:ligatures w14:val="standardContextual"/>
             </w:rPr>
           </w:pPr>
-          <w:hyperlink w:anchor="_Toc242176772" w:history="1">
+          <w:hyperlink w:anchor="_Toc242208881" w:history="1">
             <w:r>
               <w:rPr>
                 <w:rStyle w:val="a5"/>
@@ -2470,7 +2476,7 @@
               <w:rPr>
                 <w:noProof/>
               </w:rPr>
-              <w:instrText>PAGEREF _Toc242176772 \h</w:instrText>
+              <w:instrText>PAGEREF _Toc242208881 \h</w:instrText>
             </w:r>
             <w:r>
               <w:rPr>
@@ -2522,7 +2528,7 @@
               <w14:ligatures w14:val="standardContextual"/>
             </w:rPr>
           </w:pPr>
-          <w:hyperlink w:anchor="_Toc242176773" w:history="1">
+          <w:hyperlink w:anchor="_Toc242208882" w:history="1">
             <w:r>
               <w:rPr>
                 <w:rStyle w:val="a5"/>
@@ -2596,7 +2602,7 @@
               <w:rPr>
                 <w:noProof/>
               </w:rPr>
-              <w:instrText>PAGEREF _Toc242176773 \h</w:instrText>
+              <w:instrText>PAGEREF _Toc242208882 \h</w:instrText>
             </w:r>
             <w:r>
               <w:rPr>
@@ -2622,7 +2628,7 @@
               <w:rPr>
                 <w:noProof/>
               </w:rPr>
-              <w:t>20</w:t>
+              <w:t>21</w:t>
             </w:r>
             <w:r>
               <w:rPr>
@@ -2648,7 +2654,7 @@
               <w14:ligatures w14:val="standardContextual"/>
             </w:rPr>
           </w:pPr>
-          <w:hyperlink w:anchor="_Toc242176774" w:history="1">
+          <w:hyperlink w:anchor="_Toc242208883" w:history="1">
             <w:r>
               <w:rPr>
                 <w:rStyle w:val="a5"/>
@@ -2706,7 +2712,7 @@
               <w:rPr>
                 <w:noProof/>
               </w:rPr>
-              <w:instrText>PAGEREF _Toc242176774 \h</w:instrText>
+              <w:instrText>PAGEREF _Toc242208883 \h</w:instrText>
             </w:r>
             <w:r>
               <w:rPr>
@@ -2732,7 +2738,7 @@
               <w:rPr>
                 <w:noProof/>
               </w:rPr>
-              <w:t>22</w:t>
+              <w:t>23</w:t>
             </w:r>
             <w:r>
               <w:rPr>
@@ -2758,7 +2764,7 @@
               <w14:ligatures w14:val="standardContextual"/>
             </w:rPr>
           </w:pPr>
-          <w:hyperlink w:anchor="_Toc242176775" w:history="1">
+          <w:hyperlink w:anchor="_Toc242208884" w:history="1">
             <w:r>
               <w:rPr>
                 <w:rStyle w:val="a5"/>
@@ -2816,7 +2822,7 @@
               <w:rPr>
                 <w:noProof/>
               </w:rPr>
-              <w:instrText>PAGEREF _Toc242176775 \h</w:instrText>
+              <w:instrText>PAGEREF _Toc242208884 \h</w:instrText>
             </w:r>
             <w:r>
               <w:rPr>
@@ -2868,7 +2874,7 @@
               <w14:ligatures w14:val="standardContextual"/>
             </w:rPr>
           </w:pPr>
-          <w:hyperlink w:anchor="_Toc242176776" w:history="1">
+          <w:hyperlink w:anchor="_Toc242208885" w:history="1">
             <w:r>
               <w:rPr>
                 <w:rStyle w:val="a5"/>
@@ -2910,7 +2916,7 @@
               <w:rPr>
                 <w:noProof/>
               </w:rPr>
-              <w:instrText>PAGEREF _Toc242176776 \h</w:instrText>
+              <w:instrText>PAGEREF _Toc242208885 \h</w:instrText>
             </w:r>
             <w:r>
               <w:rPr>
@@ -2936,7 +2942,7 @@
               <w:rPr>
                 <w:noProof/>
               </w:rPr>
-              <w:t>23</w:t>
+              <w:t>24</w:t>
             </w:r>
             <w:r>
               <w:rPr>
@@ -2962,7 +2968,7 @@
               <w14:ligatures w14:val="standardContextual"/>
             </w:rPr>
           </w:pPr>
-          <w:hyperlink w:anchor="_Toc242176777" w:history="1">
+          <w:hyperlink w:anchor="_Toc242208886" w:history="1">
             <w:r>
               <w:rPr>
                 <w:rStyle w:val="a5"/>
@@ -3020,7 +3026,7 @@
               <w:rPr>
                 <w:noProof/>
               </w:rPr>
-              <w:instrText>PAGEREF _Toc242176777 \h</w:instrText>
+              <w:instrText>PAGEREF _Toc242208886 \h</w:instrText>
             </w:r>
             <w:r>
               <w:rPr>
@@ -3046,7 +3052,7 @@
               <w:rPr>
                 <w:noProof/>
               </w:rPr>
-              <w:t>25</w:t>
+              <w:t>26</w:t>
             </w:r>
             <w:r>
               <w:rPr>
@@ -3072,7 +3078,7 @@
               <w14:ligatures w14:val="standardContextual"/>
             </w:rPr>
           </w:pPr>
-          <w:hyperlink w:anchor="_Toc242176778" w:history="1">
+          <w:hyperlink w:anchor="_Toc242208887" w:history="1">
             <w:r>
               <w:rPr>
                 <w:rStyle w:val="a5"/>
@@ -3114,7 +3120,7 @@
               <w:rPr>
                 <w:noProof/>
               </w:rPr>
-              <w:instrText>PAGEREF _Toc242176778 \h</w:instrText>
+              <w:instrText>PAGEREF _Toc242208887 \h</w:instrText>
             </w:r>
             <w:r>
               <w:rPr>
@@ -3140,7 +3146,7 @@
               <w:rPr>
                 <w:noProof/>
               </w:rPr>
-              <w:t>27</w:t>
+              <w:t>28</w:t>
             </w:r>
             <w:r>
               <w:rPr>
@@ -3166,7 +3172,7 @@
               <w14:ligatures w14:val="standardContextual"/>
             </w:rPr>
           </w:pPr>
-          <w:hyperlink w:anchor="_Toc242176779" w:history="1">
+          <w:hyperlink w:anchor="_Toc242208888" w:history="1">
             <w:r>
               <w:rPr>
                 <w:rStyle w:val="a5"/>
@@ -3240,7 +3246,7 @@
               <w:rPr>
                 <w:noProof/>
               </w:rPr>
-              <w:instrText>PAGEREF _Toc242176779 \h</w:instrText>
+              <w:instrText>PAGEREF _Toc242208888 \h</w:instrText>
             </w:r>
             <w:r>
               <w:rPr>
@@ -3266,7 +3272,7 @@
               <w:rPr>
                 <w:noProof/>
               </w:rPr>
-              <w:t>27</w:t>
+              <w:t>28</w:t>
             </w:r>
             <w:r>
               <w:rPr>
@@ -3292,7 +3298,7 @@
               <w14:ligatures w14:val="standardContextual"/>
             </w:rPr>
           </w:pPr>
-          <w:hyperlink w:anchor="_Toc242176780" w:history="1">
+          <w:hyperlink w:anchor="_Toc242208889" w:history="1">
             <w:r>
               <w:rPr>
                 <w:rStyle w:val="a5"/>
@@ -3334,7 +3340,7 @@
               <w:rPr>
                 <w:noProof/>
               </w:rPr>
-              <w:instrText>PAGEREF _Toc242176780 \h</w:instrText>
+              <w:instrText>PAGEREF _Toc242208889 \h</w:instrText>
             </w:r>
             <w:r>
               <w:rPr>
@@ -3360,7 +3366,7 @@
               <w:rPr>
                 <w:noProof/>
               </w:rPr>
-              <w:t>28</w:t>
+              <w:t>29</w:t>
             </w:r>
             <w:r>
               <w:rPr>
@@ -3385,7 +3391,7 @@
               <w14:ligatures w14:val="standardContextual"/>
             </w:rPr>
           </w:pPr>
-          <w:hyperlink w:anchor="_Toc242176781" w:history="1">
+          <w:hyperlink w:anchor="_Toc242208890" w:history="1">
             <w:r>
               <w:rPr>
                 <w:rStyle w:val="a5"/>
@@ -3427,7 +3433,7 @@
               <w:rPr>
                 <w:noProof/>
               </w:rPr>
-              <w:instrText>PAGEREF _Toc242176781 \h</w:instrText>
+              <w:instrText>PAGEREF _Toc242208890 \h</w:instrText>
             </w:r>
             <w:r>
               <w:rPr>
@@ -3453,7 +3459,7 @@
               <w:rPr>
                 <w:noProof/>
               </w:rPr>
-              <w:t>30</w:t>
+              <w:t>31</w:t>
             </w:r>
             <w:r>
               <w:rPr>
@@ -3479,7 +3485,7 @@
               <w14:ligatures w14:val="standardContextual"/>
             </w:rPr>
           </w:pPr>
-          <w:hyperlink w:anchor="_Toc242176782" w:history="1">
+          <w:hyperlink w:anchor="_Toc242208891" w:history="1">
             <w:r>
               <w:rPr>
                 <w:rStyle w:val="a5"/>
@@ -3521,7 +3527,7 @@
               <w:rPr>
                 <w:noProof/>
               </w:rPr>
-              <w:instrText>PAGEREF _Toc242176782 \h</w:instrText>
+              <w:instrText>PAGEREF _Toc242208891 \h</w:instrText>
             </w:r>
             <w:r>
               <w:rPr>
@@ -3547,7 +3553,7 @@
               <w:rPr>
                 <w:noProof/>
               </w:rPr>
-              <w:t>30</w:t>
+              <w:t>31</w:t>
             </w:r>
             <w:r>
               <w:rPr>
@@ -3573,7 +3579,7 @@
               <w14:ligatures w14:val="standardContextual"/>
             </w:rPr>
           </w:pPr>
-          <w:hyperlink w:anchor="_Toc242176783" w:history="1">
+          <w:hyperlink w:anchor="_Toc242208892" w:history="1">
             <w:r>
               <w:rPr>
                 <w:rStyle w:val="a5"/>
@@ -3615,7 +3621,7 @@
               <w:rPr>
                 <w:noProof/>
               </w:rPr>
-              <w:instrText>PAGEREF _Toc242176783 \h</w:instrText>
+              <w:instrText>PAGEREF _Toc242208892 \h</w:instrText>
             </w:r>
             <w:r>
               <w:rPr>
@@ -3641,7 +3647,7 @@
               <w:rPr>
                 <w:noProof/>
               </w:rPr>
-              <w:t>30</w:t>
+              <w:t>31</w:t>
             </w:r>
             <w:r>
               <w:rPr>
@@ -3667,7 +3673,7 @@
               <w14:ligatures w14:val="standardContextual"/>
             </w:rPr>
           </w:pPr>
-          <w:hyperlink w:anchor="_Toc242176784" w:history="1">
+          <w:hyperlink w:anchor="_Toc242208893" w:history="1">
             <w:r>
               <w:rPr>
                 <w:rStyle w:val="a5"/>
@@ -3709,7 +3715,7 @@
               <w:rPr>
                 <w:noProof/>
               </w:rPr>
-              <w:instrText>PAGEREF _Toc242176784 \h</w:instrText>
+              <w:instrText>PAGEREF _Toc242208893 \h</w:instrText>
             </w:r>
             <w:r>
               <w:rPr>
@@ -3735,7 +3741,7 @@
               <w:rPr>
                 <w:noProof/>
               </w:rPr>
-              <w:t>30</w:t>
+              <w:t>31</w:t>
             </w:r>
             <w:r>
               <w:rPr>
@@ -3761,7 +3767,7 @@
               <w14:ligatures w14:val="standardContextual"/>
             </w:rPr>
           </w:pPr>
-          <w:hyperlink w:anchor="_Toc242176785" w:history="1">
+          <w:hyperlink w:anchor="_Toc242208894" w:history="1">
             <w:r>
               <w:rPr>
                 <w:rStyle w:val="a5"/>
@@ -3803,7 +3809,7 @@
               <w:rPr>
                 <w:noProof/>
               </w:rPr>
-              <w:instrText>PAGEREF _Toc242176785 \h</w:instrText>
+              <w:instrText>PAGEREF _Toc242208894 \h</w:instrText>
             </w:r>
             <w:r>
               <w:rPr>
@@ -3829,7 +3835,7 @@
               <w:rPr>
                 <w:noProof/>
               </w:rPr>
-              <w:t>32</w:t>
+              <w:t>33</w:t>
             </w:r>
             <w:r>
               <w:rPr>
@@ -3855,7 +3861,7 @@
               <w14:ligatures w14:val="standardContextual"/>
             </w:rPr>
           </w:pPr>
-          <w:hyperlink w:anchor="_Toc242176786" w:history="1">
+          <w:hyperlink w:anchor="_Toc242208895" w:history="1">
             <w:r>
               <w:rPr>
                 <w:rStyle w:val="a5"/>
@@ -3897,7 +3903,7 @@
               <w:rPr>
                 <w:noProof/>
               </w:rPr>
-              <w:instrText>PAGEREF _Toc242176786 \h</w:instrText>
+              <w:instrText>PAGEREF _Toc242208895 \h</w:instrText>
             </w:r>
             <w:r>
               <w:rPr>
@@ -3923,7 +3929,7 @@
               <w:rPr>
                 <w:noProof/>
               </w:rPr>
-              <w:t>32</w:t>
+              <w:t>33</w:t>
             </w:r>
             <w:r>
               <w:rPr>
@@ -3948,7 +3954,7 @@
               <w14:ligatures w14:val="standardContextual"/>
             </w:rPr>
           </w:pPr>
-          <w:hyperlink w:anchor="_Toc242176787" w:history="1">
+          <w:hyperlink w:anchor="_Toc242208896" w:history="1">
             <w:r>
               <w:rPr>
                 <w:rStyle w:val="a5"/>
@@ -3990,7 +3996,7 @@
               <w:rPr>
                 <w:noProof/>
               </w:rPr>
-              <w:instrText>PAGEREF _Toc242176787 \h</w:instrText>
+              <w:instrText>PAGEREF _Toc242208896 \h</w:instrText>
             </w:r>
             <w:r>
               <w:rPr>
@@ -4016,7 +4022,7 @@
               <w:rPr>
                 <w:noProof/>
               </w:rPr>
-              <w:t>34</w:t>
+              <w:t>35</w:t>
             </w:r>
             <w:r>
               <w:rPr>
@@ -4041,7 +4047,7 @@
               <w14:ligatures w14:val="standardContextual"/>
             </w:rPr>
           </w:pPr>
-          <w:hyperlink w:anchor="_Toc242176788" w:history="1">
+          <w:hyperlink w:anchor="_Toc242208897" w:history="1">
             <w:r>
               <w:rPr>
                 <w:rStyle w:val="a5"/>
@@ -4075,7 +4081,7 @@
               <w:rPr>
                 <w:noProof/>
               </w:rPr>
-              <w:instrText>PAGEREF _Toc242176788 \h</w:instrText>
+              <w:instrText>PAGEREF _Toc242208897 \h</w:instrText>
             </w:r>
             <w:r>
               <w:rPr>
@@ -4101,7 +4107,7 @@
               <w:rPr>
                 <w:noProof/>
               </w:rPr>
-              <w:t>36</w:t>
+              <w:t>37</w:t>
             </w:r>
             <w:r>
               <w:rPr>
@@ -4126,7 +4132,7 @@
               <w14:ligatures w14:val="standardContextual"/>
             </w:rPr>
           </w:pPr>
-          <w:hyperlink w:anchor="_Toc242176789" w:history="1">
+          <w:hyperlink w:anchor="_Toc242208898" w:history="1">
             <w:r>
               <w:rPr>
                 <w:rStyle w:val="a5"/>
@@ -4176,7 +4182,7 @@
               <w:rPr>
                 <w:noProof/>
               </w:rPr>
-              <w:instrText>PAGEREF _Toc242176789 \h</w:instrText>
+              <w:instrText>PAGEREF _Toc242208898 \h</w:instrText>
             </w:r>
             <w:r>
               <w:rPr>
@@ -4202,7 +4208,7 @@
               <w:rPr>
                 <w:noProof/>
               </w:rPr>
-              <w:t>37</w:t>
+              <w:t>38</w:t>
             </w:r>
             <w:r>
               <w:rPr>
@@ -4227,7 +4233,7 @@
               <w14:ligatures w14:val="standardContextual"/>
             </w:rPr>
           </w:pPr>
-          <w:hyperlink w:anchor="_Toc242176790" w:history="1">
+          <w:hyperlink w:anchor="_Toc242208899" w:history="1">
             <w:r>
               <w:rPr>
                 <w:rStyle w:val="a5"/>
@@ -4277,7 +4283,7 @@
               <w:rPr>
                 <w:noProof/>
               </w:rPr>
-              <w:instrText>PAGEREF _Toc242176790 \h</w:instrText>
+              <w:instrText>PAGEREF _Toc242208899 \h</w:instrText>
             </w:r>
             <w:r>
               <w:rPr>
@@ -4303,7 +4309,7 @@
               <w:rPr>
                 <w:noProof/>
               </w:rPr>
-              <w:t>38</w:t>
+              <w:t>39</w:t>
             </w:r>
             <w:r>
               <w:rPr>
@@ -4326,7 +4332,7 @@
         <w:pStyle w:val="1"/>
         <w:pageBreakBefore/>
       </w:pPr>
-      <w:bookmarkStart w:id="0" w:name="_Toc242176752"/>
+      <w:bookmarkStart w:id="0" w:name="_Toc242208861"/>
       <w:r>
         <w:lastRenderedPageBreak/>
         <w:t>摘　要</w:t>
@@ -4618,13 +4624,25 @@
         <w:t xml:space="preserve"> 0.132</w:t>
       </w:r>
       <w:r>
-        <w:t>、性价比比仅</w:t>
+        <w:t>，牌价口径性价比比仅</w:t>
       </w:r>
       <w:r>
         <w:t xml:space="preserve"> 1.45</w:t>
       </w:r>
       <w:r>
-        <w:t>；经典启发式基线（</w:t>
+        <w:t>，账单口径下（两模型实际支出几乎持平：</w:t>
+      </w:r>
+      <w:r>
+        <w:t>¥1.30 vs ¥1.29</w:t>
+      </w:r>
+      <w:r>
+        <w:t>）比值进一步跌至</w:t>
+      </w:r>
+      <w:r>
+        <w:t xml:space="preserve"> 0.67</w:t>
+      </w:r>
+      <w:r>
+        <w:t>、方向反转；经典启发式基线（</w:t>
       </w:r>
       <w:r>
         <w:t>NN+2-opt / FFD / LPT</w:t>
@@ -4642,19 +4660,31 @@
         <w:t xml:space="preserve"> LLM </w:t>
       </w:r>
       <w:r>
-        <w:t>的直接求解。整个实验总成本约</w:t>
-      </w:r>
-      <w:r>
-        <w:t xml:space="preserve"> ¥4.4</w:t>
-      </w:r>
-      <w:r>
-        <w:t>，远低于</w:t>
+        <w:t>的直接求解。全部实验的账单实测总成本</w:t>
+      </w:r>
+      <w:r>
+        <w:t xml:space="preserve"> ¥2.59</w:t>
+      </w:r>
+      <w:r>
+        <w:t>（</w:t>
+      </w:r>
+      <w:r>
+        <w:t>deepseek ¥1.30 + qwen ¥1.29</w:t>
+      </w:r>
+      <w:r>
+        <w:t>），仅为</w:t>
       </w:r>
       <w:r>
         <w:t xml:space="preserve"> ¥20 </w:t>
       </w:r>
       <w:r>
-        <w:t>的预算估算，验证了成本受控设计的有效性。</w:t>
+        <w:t>预算估算的约</w:t>
+      </w:r>
+      <w:r>
+        <w:t xml:space="preserve"> 1/8</w:t>
+      </w:r>
+      <w:r>
+        <w:t>，验证了成本受控设计的有效性。</w:t>
       </w:r>
     </w:p>
     <w:p>
@@ -4677,7 +4707,7 @@
         <w:pStyle w:val="1"/>
         <w:pageBreakBefore/>
       </w:pPr>
-      <w:bookmarkStart w:id="1" w:name="_Toc242176753"/>
+      <w:bookmarkStart w:id="1" w:name="_Toc242208862"/>
       <w:r>
         <w:lastRenderedPageBreak/>
         <w:t>1</w:t>
@@ -4691,7 +4721,7 @@
       <w:pPr>
         <w:pStyle w:val="2"/>
       </w:pPr>
-      <w:bookmarkStart w:id="2" w:name="_Toc242176754"/>
+      <w:bookmarkStart w:id="2" w:name="_Toc242208863"/>
       <w:r>
         <w:t>1.1</w:t>
       </w:r>
@@ -4971,7 +5001,7 @@
       <w:pPr>
         <w:pStyle w:val="2"/>
       </w:pPr>
-      <w:bookmarkStart w:id="3" w:name="_Toc242176755"/>
+      <w:bookmarkStart w:id="3" w:name="_Toc242208864"/>
       <w:r>
         <w:t>1.2</w:t>
       </w:r>
@@ -5199,7 +5229,7 @@
       <w:pPr>
         <w:pStyle w:val="2"/>
       </w:pPr>
-      <w:bookmarkStart w:id="4" w:name="_Toc242176756"/>
+      <w:bookmarkStart w:id="4" w:name="_Toc242208865"/>
       <w:r>
         <w:t>1.3</w:t>
       </w:r>
@@ -5443,13 +5473,19 @@
         <w:t xml:space="preserve"> 360 </w:t>
       </w:r>
       <w:r>
-        <w:t>次运行、总成本约</w:t>
-      </w:r>
-      <w:r>
-        <w:t xml:space="preserve"> ¥4.4</w:t>
-      </w:r>
-      <w:r>
-        <w:t>；按预登记假设组织统计检验，其中一条预登记假设被数据证伪</w:t>
+        <w:t>次运行、账单实测总成本</w:t>
+      </w:r>
+      <w:r>
+        <w:t xml:space="preserve"> ¥2.59</w:t>
+      </w:r>
+      <w:r>
+        <w:t>（牌价折算</w:t>
+      </w:r>
+      <w:r>
+        <w:t xml:space="preserve"> ¥4.36</w:t>
+      </w:r>
+      <w:r>
+        <w:t>）；按预登记假设组织统计检验，其中一条预登记假设被数据证伪</w:t>
       </w:r>
       <w:r>
         <w:t>——</w:t>
@@ -5469,7 +5505,7 @@
         <w:pStyle w:val="1"/>
         <w:pageBreakBefore/>
       </w:pPr>
-      <w:bookmarkStart w:id="5" w:name="_Toc242176757"/>
+      <w:bookmarkStart w:id="5" w:name="_Toc242208866"/>
       <w:r>
         <w:lastRenderedPageBreak/>
         <w:t>2</w:t>
@@ -5483,7 +5519,7 @@
       <w:pPr>
         <w:pStyle w:val="2"/>
       </w:pPr>
-      <w:bookmarkStart w:id="6" w:name="_Toc242176758"/>
+      <w:bookmarkStart w:id="6" w:name="_Toc242208867"/>
       <w:r>
         <w:t>2.1</w:t>
       </w:r>
@@ -5647,7 +5683,7 @@
           <w:left w:w="10" w:type="dxa"/>
           <w:right w:w="10" w:type="dxa"/>
         </w:tblCellMar>
-        <w:tblLook w:val="0000" w:firstRow="0" w:lastRow="0" w:firstColumn="0" w:lastColumn="0" w:noHBand="0" w:noVBand="0"/>
+        <w:tblLook w:val="04A0" w:firstRow="1" w:lastRow="0" w:firstColumn="1" w:lastColumn="0" w:noHBand="0" w:noVBand="1"/>
       </w:tblPr>
       <w:tblGrid>
         <w:gridCol w:w="1050"/>
@@ -8718,7 +8754,7 @@
       <w:pPr>
         <w:pStyle w:val="2"/>
       </w:pPr>
-      <w:bookmarkStart w:id="7" w:name="_Toc242176759"/>
+      <w:bookmarkStart w:id="7" w:name="_Toc242208868"/>
       <w:r>
         <w:t>2.2</w:t>
       </w:r>
@@ -9320,7 +9356,7 @@
           <w:left w:w="10" w:type="dxa"/>
           <w:right w:w="10" w:type="dxa"/>
         </w:tblCellMar>
-        <w:tblLook w:val="0000" w:firstRow="0" w:lastRow="0" w:firstColumn="0" w:lastColumn="0" w:noHBand="0" w:noVBand="0"/>
+        <w:tblLook w:val="04A0" w:firstRow="1" w:lastRow="0" w:firstColumn="1" w:lastColumn="0" w:noHBand="0" w:noVBand="1"/>
       </w:tblPr>
       <w:tblGrid>
         <w:gridCol w:w="8312"/>
@@ -9464,7 +9500,7 @@
         <w:pStyle w:val="1"/>
         <w:pageBreakBefore/>
       </w:pPr>
-      <w:bookmarkStart w:id="8" w:name="_Toc242176760"/>
+      <w:bookmarkStart w:id="8" w:name="_Toc242208869"/>
       <w:r>
         <w:lastRenderedPageBreak/>
         <w:t>3</w:t>
@@ -9484,7 +9520,7 @@
       <w:pPr>
         <w:pStyle w:val="2"/>
       </w:pPr>
-      <w:bookmarkStart w:id="9" w:name="_Toc242176761"/>
+      <w:bookmarkStart w:id="9" w:name="_Toc242208870"/>
       <w:r>
         <w:t>3.1</w:t>
       </w:r>
@@ -9783,7 +9819,7 @@
       <w:pPr>
         <w:pStyle w:val="2"/>
       </w:pPr>
-      <w:bookmarkStart w:id="10" w:name="_Toc242176762"/>
+      <w:bookmarkStart w:id="10" w:name="_Toc242208871"/>
       <w:r>
         <w:t>3.2</w:t>
       </w:r>
@@ -9989,7 +10025,7 @@
           <w:left w:w="10" w:type="dxa"/>
           <w:right w:w="10" w:type="dxa"/>
         </w:tblCellMar>
-        <w:tblLook w:val="0000" w:firstRow="0" w:lastRow="0" w:firstColumn="0" w:lastColumn="0" w:noHBand="0" w:noVBand="0"/>
+        <w:tblLook w:val="04A0" w:firstRow="1" w:lastRow="0" w:firstColumn="1" w:lastColumn="0" w:noHBand="0" w:noVBand="1"/>
       </w:tblPr>
       <w:tblGrid>
         <w:gridCol w:w="1750"/>
@@ -12014,7 +12050,7 @@
       <w:pPr>
         <w:pStyle w:val="2"/>
       </w:pPr>
-      <w:bookmarkStart w:id="11" w:name="_Toc242176763"/>
+      <w:bookmarkStart w:id="11" w:name="_Toc242208872"/>
       <w:r>
         <w:t>3.3</w:t>
       </w:r>
@@ -12249,6 +12285,181 @@
         <w:ind w:firstLine="480"/>
       </w:pPr>
       <w:r>
+        <w:rPr>
+          <w:b/>
+          <w:bCs/>
+        </w:rPr>
+        <w:t>账单口径的补充核对</w:t>
+      </w:r>
+      <w:r>
+        <w:t>：实验结束后与服务商账单对账发现，两家提供商均未按上述牌价表计费</w:t>
+      </w:r>
+      <w:r>
+        <w:t xml:space="preserve">——DeepSeek </w:t>
+      </w:r>
+      <w:r>
+        <w:t>账单显示实际计费档位为</w:t>
+      </w:r>
+      <w:r>
+        <w:t xml:space="preserve"> deepseek-flash</w:t>
+      </w:r>
+      <w:r>
+        <w:t>（闲时资费，输入缓存未命中</w:t>
+      </w:r>
+      <w:r>
+        <w:t xml:space="preserve"> ¥1/</w:t>
+      </w:r>
+      <w:r>
+        <w:t>百万、缓存命中</w:t>
+      </w:r>
+      <w:r>
+        <w:t xml:space="preserve"> ¥0.02/</w:t>
+      </w:r>
+      <w:r>
+        <w:t>百万），阿里云账单显示计费档位为</w:t>
+      </w:r>
+      <w:r>
+        <w:t xml:space="preserve"> qwen3.8-flash</w:t>
+      </w:r>
+      <w:r>
+        <w:t>（输入</w:t>
+      </w:r>
+      <w:r>
+        <w:t xml:space="preserve"> ¥0.8 / </w:t>
+      </w:r>
+      <w:r>
+        <w:t>输出</w:t>
+      </w:r>
+      <w:r>
+        <w:t xml:space="preserve"> ¥2.7/</w:t>
+      </w:r>
+      <w:r>
+        <w:t>百万，缓存命中</w:t>
+      </w:r>
+      <w:r>
+        <w:t xml:space="preserve"> ¥0.1/</w:t>
+      </w:r>
+      <w:r>
+        <w:t>百万），且两平台的上下文缓存机制显著降低了实际支出。全周期账单实测：</w:t>
+      </w:r>
+      <w:r>
+        <w:t>deepseek ¥1.30</w:t>
+      </w:r>
+      <w:r>
+        <w:t>（</w:t>
+      </w:r>
+      <w:r>
+        <w:t xml:space="preserve">532 </w:t>
+      </w:r>
+      <w:r>
+        <w:t>次调用、</w:t>
+      </w:r>
+      <w:r>
+        <w:t>828,396 tokens</w:t>
+      </w:r>
+      <w:r>
+        <w:t>，与实验记录的</w:t>
+      </w:r>
+      <w:r>
+        <w:t xml:space="preserve"> 527 </w:t>
+      </w:r>
+      <w:r>
+        <w:t>次</w:t>
+      </w:r>
+      <w:r>
+        <w:t xml:space="preserve">/810,072 tokens </w:t>
+      </w:r>
+      <w:r>
+        <w:t>吻合，差额为少量实验外调用）、</w:t>
+      </w:r>
+      <w:r>
+        <w:t>qwen ¥1.29</w:t>
+      </w:r>
+      <w:r>
+        <w:t>，合计</w:t>
+      </w:r>
+      <w:r>
+        <w:t xml:space="preserve"> </w:t>
+      </w:r>
+      <w:r>
+        <w:rPr>
+          <w:b/>
+          <w:bCs/>
+        </w:rPr>
+        <w:t>¥2.59</w:t>
+      </w:r>
+      <w:r>
+        <w:t>——</w:t>
+      </w:r>
+      <w:r>
+        <w:t>牌价折算口径（</w:t>
+      </w:r>
+      <w:r>
+        <w:t>¥4.36</w:t>
+      </w:r>
+      <w:r>
+        <w:t>）高估了</w:t>
+      </w:r>
+      <w:r>
+        <w:t xml:space="preserve"> 68%</w:t>
+      </w:r>
+      <w:r>
+        <w:t>。请求别名（</w:t>
+      </w:r>
+      <w:r>
+        <w:t>deepseek-chat/qwen-plus</w:t>
+      </w:r>
+      <w:r>
+        <w:t>）与实际服务计费档位（</w:t>
+      </w:r>
+      <w:r>
+        <w:t>deepseek-flash/qwen3.8-flash</w:t>
+      </w:r>
+      <w:r>
+        <w:t>）的</w:t>
+      </w:r>
+      <w:r>
+        <w:rPr>
+          <w:b/>
+          <w:bCs/>
+        </w:rPr>
+        <w:t>别名漂移</w:t>
+      </w:r>
+      <w:r>
+        <w:t>本身构成一个可复现性发现：评测协议仅记录请求侧模型名不足以锁定被测对象，还应记录响应</w:t>
+      </w:r>
+      <w:r>
+        <w:t xml:space="preserve"> model </w:t>
+      </w:r>
+      <w:r>
+        <w:t>字段与账单计费档位（本工作</w:t>
+      </w:r>
+      <w:r>
+        <w:t xml:space="preserve"> transcript </w:t>
+      </w:r>
+      <w:r>
+        <w:t>未记录响应侧字段，已列入</w:t>
+      </w:r>
+      <w:r>
+        <w:t xml:space="preserve"> 6.5 </w:t>
+      </w:r>
+      <w:r>
+        <w:t>节改进项）。下文所有总量结论以账单实测为准，逐</w:t>
+      </w:r>
+      <w:r>
+        <w:t xml:space="preserve"> run </w:t>
+      </w:r>
+      <w:r>
+        <w:t>成本分解保留牌价折算口径（预登记口径）并明确标注。</w:t>
+      </w:r>
+    </w:p>
+    <w:p>
+      <w:pPr>
+        <w:spacing w:line="360" w:lineRule="auto"/>
+        <w:ind w:firstLine="480"/>
+      </w:pPr>
+      <w:r>
+        <w:lastRenderedPageBreak/>
         <w:t>与四大基准的本质区别在于：</w:t>
       </w:r>
       <w:r>
@@ -12310,7 +12521,7 @@
       <w:pPr>
         <w:pStyle w:val="2"/>
       </w:pPr>
-      <w:bookmarkStart w:id="12" w:name="_Toc242176764"/>
+      <w:bookmarkStart w:id="12" w:name="_Toc242208873"/>
       <w:r>
         <w:t>3.4</w:t>
       </w:r>
@@ -12564,7 +12775,6 @@
         <w:ind w:firstLine="480"/>
       </w:pPr>
       <w:r>
-        <w:lastRenderedPageBreak/>
         <w:t>三层版本锚定：（</w:t>
       </w:r>
       <w:r>
@@ -12750,7 +12960,7 @@
       <w:pPr>
         <w:pStyle w:val="2"/>
       </w:pPr>
-      <w:bookmarkStart w:id="13" w:name="_Toc242176765"/>
+      <w:bookmarkStart w:id="13" w:name="_Toc242208874"/>
       <w:r>
         <w:t>3.5</w:t>
       </w:r>
@@ -12814,7 +13024,11 @@
         <w:t>表示</w:t>
       </w:r>
       <w:r>
-        <w:t>，失败发生在解的生成过程。两套分类维度不同、互不可替代。</w:t>
+        <w:t>，失</w:t>
+      </w:r>
+      <w:r>
+        <w:lastRenderedPageBreak/>
+        <w:t>败发生在解的生成过程。两套分类维度不同、互不可替代。</w:t>
       </w:r>
       <w:r>
         <w:t xml:space="preserve">F1–F6 </w:t>
@@ -12879,7 +13093,7 @@
           <w:left w:w="10" w:type="dxa"/>
           <w:right w:w="10" w:type="dxa"/>
         </w:tblCellMar>
-        <w:tblLook w:val="0000" w:firstRow="0" w:lastRow="0" w:firstColumn="0" w:lastColumn="0" w:noHBand="0" w:noVBand="0"/>
+        <w:tblLook w:val="04A0" w:firstRow="1" w:lastRow="0" w:firstColumn="1" w:lastColumn="0" w:noHBand="0" w:noVBand="1"/>
       </w:tblPr>
       <w:tblGrid>
         <w:gridCol w:w="550"/>
@@ -14262,11 +14476,7 @@
         <w:t>——</w:t>
       </w:r>
       <w:r>
-        <w:t>引</w:t>
-      </w:r>
-      <w:r>
-        <w:lastRenderedPageBreak/>
-        <w:t>用了解空间外的实体）先于</w:t>
+        <w:t>引用了解空间外的实体）先于</w:t>
       </w:r>
       <w:r>
         <w:t xml:space="preserve"> F2</w:t>
@@ -14304,7 +14514,7 @@
         <w:pStyle w:val="1"/>
         <w:pageBreakBefore/>
       </w:pPr>
-      <w:bookmarkStart w:id="14" w:name="_Toc242176766"/>
+      <w:bookmarkStart w:id="14" w:name="_Toc242208875"/>
       <w:r>
         <w:lastRenderedPageBreak/>
         <w:t>4</w:t>
@@ -14318,7 +14528,7 @@
       <w:pPr>
         <w:pStyle w:val="2"/>
       </w:pPr>
-      <w:bookmarkStart w:id="15" w:name="_Toc242176767"/>
+      <w:bookmarkStart w:id="15" w:name="_Toc242208876"/>
       <w:r>
         <w:t>4.1</w:t>
       </w:r>
@@ -14875,7 +15085,7 @@
       <w:pPr>
         <w:pStyle w:val="2"/>
       </w:pPr>
-      <w:bookmarkStart w:id="16" w:name="_Toc242176768"/>
+      <w:bookmarkStart w:id="16" w:name="_Toc242208877"/>
       <w:r>
         <w:t>4.2</w:t>
       </w:r>
@@ -15068,7 +15278,7 @@
           <w:left w:w="10" w:type="dxa"/>
           <w:right w:w="10" w:type="dxa"/>
         </w:tblCellMar>
-        <w:tblLook w:val="0000" w:firstRow="0" w:lastRow="0" w:firstColumn="0" w:lastColumn="0" w:noHBand="0" w:noVBand="0"/>
+        <w:tblLook w:val="04A0" w:firstRow="1" w:lastRow="0" w:firstColumn="1" w:lastColumn="0" w:noHBand="0" w:noVBand="1"/>
       </w:tblPr>
       <w:tblGrid>
         <w:gridCol w:w="2200"/>
@@ -15872,7 +16082,7 @@
       <w:pPr>
         <w:pStyle w:val="2"/>
       </w:pPr>
-      <w:bookmarkStart w:id="17" w:name="_Toc242176769"/>
+      <w:bookmarkStart w:id="17" w:name="_Toc242208878"/>
       <w:r>
         <w:t>4.3</w:t>
       </w:r>
@@ -16054,7 +16264,7 @@
           <w:left w:w="10" w:type="dxa"/>
           <w:right w:w="10" w:type="dxa"/>
         </w:tblCellMar>
-        <w:tblLook w:val="0000" w:firstRow="0" w:lastRow="0" w:firstColumn="0" w:lastColumn="0" w:noHBand="0" w:noVBand="0"/>
+        <w:tblLook w:val="04A0" w:firstRow="1" w:lastRow="0" w:firstColumn="1" w:lastColumn="0" w:noHBand="0" w:noVBand="1"/>
       </w:tblPr>
       <w:tblGrid>
         <w:gridCol w:w="8312"/>
@@ -16177,7 +16387,7 @@
         <w:pStyle w:val="1"/>
         <w:pageBreakBefore/>
       </w:pPr>
-      <w:bookmarkStart w:id="18" w:name="_Toc242176770"/>
+      <w:bookmarkStart w:id="18" w:name="_Toc242208879"/>
       <w:r>
         <w:lastRenderedPageBreak/>
         <w:t>5</w:t>
@@ -16191,7 +16401,7 @@
       <w:pPr>
         <w:pStyle w:val="2"/>
       </w:pPr>
-      <w:bookmarkStart w:id="19" w:name="_Toc242176771"/>
+      <w:bookmarkStart w:id="19" w:name="_Toc242208880"/>
       <w:r>
         <w:t>5.1</w:t>
       </w:r>
@@ -16343,7 +16553,7 @@
           <w:left w:w="10" w:type="dxa"/>
           <w:right w:w="10" w:type="dxa"/>
         </w:tblCellMar>
-        <w:tblLook w:val="0000" w:firstRow="0" w:lastRow="0" w:firstColumn="0" w:lastColumn="0" w:noHBand="0" w:noVBand="0"/>
+        <w:tblLook w:val="04A0" w:firstRow="1" w:lastRow="0" w:firstColumn="1" w:lastColumn="0" w:noHBand="0" w:noVBand="1"/>
       </w:tblPr>
       <w:tblGrid>
         <w:gridCol w:w="1400"/>
@@ -17529,7 +17739,7 @@
       <w:pPr>
         <w:pStyle w:val="2"/>
       </w:pPr>
-      <w:bookmarkStart w:id="20" w:name="_Toc242176772"/>
+      <w:bookmarkStart w:id="20" w:name="_Toc242208881"/>
       <w:r>
         <w:t>5.2</w:t>
       </w:r>
@@ -17569,13 +17779,13 @@
         <w:t xml:space="preserve">360 runs </w:t>
       </w:r>
       <w:r>
-        <w:t>两模型全量跑完、无中断丢失（欠费中断经修复后的续跑机制恢复）；总成本约</w:t>
-      </w:r>
-      <w:r>
-        <w:t xml:space="preserve"> ¥4.4</w:t>
-      </w:r>
-      <w:r>
-        <w:t>，为</w:t>
+        <w:t>两模型全量跑完、无中断丢失（欠费中断经修复后的续跑机制恢复）；账单实测总成本</w:t>
+      </w:r>
+      <w:r>
+        <w:t xml:space="preserve"> ¥2.59</w:t>
+      </w:r>
+      <w:r>
+        <w:t>，仅为</w:t>
       </w:r>
       <w:r>
         <w:t xml:space="preserve"> ¥20 </w:t>
@@ -17584,10 +17794,28 @@
         <w:t>预算估算的约</w:t>
       </w:r>
       <w:r>
+        <w:t xml:space="preserve"> 1/8</w:t>
+      </w:r>
+      <w:r>
+        <w:t>（牌价折算口径</w:t>
+      </w:r>
+      <w:r>
+        <w:t xml:space="preserve"> ¥4.36</w:t>
+      </w:r>
+      <w:r>
+        <w:t>、约</w:t>
+      </w:r>
+      <w:r>
         <w:t xml:space="preserve"> 1/5</w:t>
       </w:r>
       <w:r>
-        <w:t>，熔断线</w:t>
+        <w:t>，见</w:t>
+      </w:r>
+      <w:r>
+        <w:t xml:space="preserve"> 3.3 </w:t>
+      </w:r>
+      <w:r>
+        <w:t>节对账说明），熔断线</w:t>
       </w:r>
       <w:r>
         <w:t xml:space="preserve"> ¥50 </w:t>
@@ -17664,7 +17892,7 @@
           <w:left w:w="10" w:type="dxa"/>
           <w:right w:w="10" w:type="dxa"/>
         </w:tblCellMar>
-        <w:tblLook w:val="0000" w:firstRow="0" w:lastRow="0" w:firstColumn="0" w:lastColumn="0" w:noHBand="0" w:noVBand="0"/>
+        <w:tblLook w:val="04A0" w:firstRow="1" w:lastRow="0" w:firstColumn="1" w:lastColumn="0" w:noHBand="0" w:noVBand="1"/>
       </w:tblPr>
       <w:tblGrid>
         <w:gridCol w:w="1500"/>
@@ -17987,7 +18215,14 @@
                 <w:sz w:val="18"/>
                 <w:szCs w:val="18"/>
               </w:rPr>
-              <w:t>≈ ¥4.4</w:t>
+              <w:t>实测</w:t>
+            </w:r>
+            <w:r>
+              <w:rPr>
+                <w:sz w:val="18"/>
+                <w:szCs w:val="18"/>
+              </w:rPr>
+              <w:t xml:space="preserve"> ¥2.59</w:t>
             </w:r>
           </w:p>
         </w:tc>
@@ -18017,42 +18252,70 @@
                 <w:sz w:val="18"/>
                 <w:szCs w:val="18"/>
               </w:rPr>
-              <w:t>主实验</w:t>
-            </w:r>
-            <w:r>
-              <w:rPr>
-                <w:sz w:val="18"/>
-                <w:szCs w:val="18"/>
-              </w:rPr>
-              <w:t xml:space="preserve"> ¥1.06</w:t>
-            </w:r>
-            <w:r>
-              <w:rPr>
-                <w:sz w:val="18"/>
-                <w:szCs w:val="18"/>
-              </w:rPr>
-              <w:t>（</w:t>
-            </w:r>
-            <w:r>
-              <w:rPr>
-                <w:sz w:val="18"/>
-                <w:szCs w:val="18"/>
-              </w:rPr>
-              <w:t>deepseek ¥0.70 / qwen ¥0.36</w:t>
-            </w:r>
-            <w:r>
-              <w:rPr>
-                <w:sz w:val="18"/>
-                <w:szCs w:val="18"/>
-              </w:rPr>
-              <w:t>）</w:t>
-            </w:r>
-            <w:r>
-              <w:rPr>
-                <w:sz w:val="18"/>
-                <w:szCs w:val="18"/>
-              </w:rPr>
-              <w:t xml:space="preserve">+ </w:t>
+              <w:t>账单口径：</w:t>
+            </w:r>
+            <w:r>
+              <w:rPr>
+                <w:sz w:val="18"/>
+                <w:szCs w:val="18"/>
+              </w:rPr>
+              <w:t>deepseek ¥1.30</w:t>
+            </w:r>
+            <w:r>
+              <w:rPr>
+                <w:sz w:val="18"/>
+                <w:szCs w:val="18"/>
+              </w:rPr>
+              <w:t>（含约</w:t>
+            </w:r>
+            <w:r>
+              <w:rPr>
+                <w:sz w:val="18"/>
+                <w:szCs w:val="18"/>
+              </w:rPr>
+              <w:t xml:space="preserve"> ¥0.17 </w:t>
+            </w:r>
+            <w:r>
+              <w:rPr>
+                <w:sz w:val="18"/>
+                <w:szCs w:val="18"/>
+              </w:rPr>
+              <w:t>的中断重跑与冒烟测试）</w:t>
+            </w:r>
+            <w:r>
+              <w:rPr>
+                <w:sz w:val="18"/>
+                <w:szCs w:val="18"/>
+              </w:rPr>
+              <w:t>+ qwen ¥1.29</w:t>
+            </w:r>
+            <w:r>
+              <w:rPr>
+                <w:sz w:val="18"/>
+                <w:szCs w:val="18"/>
+              </w:rPr>
+              <w:t>；牌价折算口径</w:t>
+            </w:r>
+            <w:r>
+              <w:rPr>
+                <w:sz w:val="18"/>
+                <w:szCs w:val="18"/>
+              </w:rPr>
+              <w:t xml:space="preserve"> ¥4.36</w:t>
+            </w:r>
+            <w:r>
+              <w:rPr>
+                <w:sz w:val="18"/>
+                <w:szCs w:val="18"/>
+              </w:rPr>
+              <w:t>（主实验</w:t>
+            </w:r>
+            <w:r>
+              <w:rPr>
+                <w:sz w:val="18"/>
+                <w:szCs w:val="18"/>
+              </w:rPr>
+              <w:t xml:space="preserve"> ¥1.06 + </w:t>
             </w:r>
             <w:r>
               <w:rPr>
@@ -18073,7 +18336,7 @@
                 <w:sz w:val="18"/>
                 <w:szCs w:val="18"/>
               </w:rPr>
-              <w:t>；远低于</w:t>
+              <w:t>）。远低于</w:t>
             </w:r>
             <w:r>
               <w:rPr>
@@ -18338,7 +18601,7 @@
                 <w:sz w:val="18"/>
                 <w:szCs w:val="18"/>
               </w:rPr>
-              <w:t>1.45×</w:t>
+              <w:t>1.45× → 0.67×</w:t>
             </w:r>
           </w:p>
         </w:tc>
@@ -18368,21 +18631,14 @@
                 <w:sz w:val="18"/>
                 <w:szCs w:val="18"/>
               </w:rPr>
-              <w:t xml:space="preserve">qwen-plus </w:t>
-            </w:r>
-            <w:r>
-              <w:rPr>
-                <w:sz w:val="18"/>
-                <w:szCs w:val="18"/>
-              </w:rPr>
-              <w:t>每元</w:t>
-            </w:r>
-            <w:r>
-              <w:rPr>
-                <w:sz w:val="18"/>
-                <w:szCs w:val="18"/>
-              </w:rPr>
-              <w:t xml:space="preserve"> QYI</w:t>
+              <w:t>牌价口径：</w:t>
+            </w:r>
+            <w:r>
+              <w:rPr>
+                <w:sz w:val="18"/>
+                <w:szCs w:val="18"/>
+              </w:rPr>
+              <w:t>qwen 1.10 vs deepseek 0.76</w:t>
             </w:r>
             <w:r>
               <w:rPr>
@@ -18396,21 +18652,35 @@
                 <w:sz w:val="18"/>
                 <w:szCs w:val="18"/>
               </w:rPr>
-              <w:t>1.10</w:t>
-            </w:r>
-            <w:r>
-              <w:rPr>
-                <w:sz w:val="18"/>
-                <w:szCs w:val="18"/>
-              </w:rPr>
-              <w:t>）为</w:t>
-            </w:r>
-            <w:r>
-              <w:rPr>
-                <w:sz w:val="18"/>
-                <w:szCs w:val="18"/>
-              </w:rPr>
-              <w:t xml:space="preserve"> deepseek-chat</w:t>
+              <w:t xml:space="preserve">1.45 </w:t>
+            </w:r>
+            <w:r>
+              <w:rPr>
+                <w:sz w:val="18"/>
+                <w:szCs w:val="18"/>
+              </w:rPr>
+              <w:t>倍，低于预登记</w:t>
+            </w:r>
+            <w:r>
+              <w:rPr>
+                <w:sz w:val="18"/>
+                <w:szCs w:val="18"/>
+              </w:rPr>
+              <w:t xml:space="preserve"> 2 </w:t>
+            </w:r>
+            <w:r>
+              <w:rPr>
+                <w:sz w:val="18"/>
+                <w:szCs w:val="18"/>
+              </w:rPr>
+              <w:t>倍阈值）；账单口径：</w:t>
+            </w:r>
+            <w:r>
+              <w:rPr>
+                <w:sz w:val="18"/>
+                <w:szCs w:val="18"/>
+              </w:rPr>
+              <w:t>qwen 1.28 vs deepseek 1.92</w:t>
             </w:r>
             <w:r>
               <w:rPr>
@@ -18424,70 +18694,28 @@
                 <w:sz w:val="18"/>
                 <w:szCs w:val="18"/>
               </w:rPr>
-              <w:t>0.76</w:t>
-            </w:r>
-            <w:r>
-              <w:rPr>
-                <w:sz w:val="18"/>
-                <w:szCs w:val="18"/>
-              </w:rPr>
-              <w:t>）的</w:t>
-            </w:r>
-            <w:r>
-              <w:rPr>
-                <w:sz w:val="18"/>
-                <w:szCs w:val="18"/>
-              </w:rPr>
-              <w:t xml:space="preserve"> 1.45 </w:t>
-            </w:r>
-            <w:r>
-              <w:rPr>
-                <w:sz w:val="18"/>
-                <w:szCs w:val="18"/>
-              </w:rPr>
-              <w:t>倍</w:t>
-            </w:r>
-            <w:r>
-              <w:rPr>
-                <w:sz w:val="18"/>
-                <w:szCs w:val="18"/>
-              </w:rPr>
-              <w:t>——</w:t>
-            </w:r>
-            <w:r>
-              <w:rPr>
-                <w:sz w:val="18"/>
-                <w:szCs w:val="18"/>
-              </w:rPr>
-              <w:t>低于预登记的</w:t>
-            </w:r>
-            <w:r>
-              <w:rPr>
-                <w:sz w:val="18"/>
-                <w:szCs w:val="18"/>
-              </w:rPr>
-              <w:t xml:space="preserve"> 2 </w:t>
-            </w:r>
-            <w:r>
-              <w:rPr>
-                <w:sz w:val="18"/>
-                <w:szCs w:val="18"/>
-              </w:rPr>
-              <w:t>倍阈值（</w:t>
-            </w:r>
-            <w:r>
-              <w:rPr>
-                <w:sz w:val="18"/>
-                <w:szCs w:val="18"/>
-              </w:rPr>
-              <w:t xml:space="preserve">H4 </w:t>
-            </w:r>
-            <w:r>
-              <w:rPr>
-                <w:sz w:val="18"/>
-                <w:szCs w:val="18"/>
-              </w:rPr>
-              <w:t>证伪，见</w:t>
+              <w:t xml:space="preserve">0.67 </w:t>
+            </w:r>
+            <w:r>
+              <w:rPr>
+                <w:sz w:val="18"/>
+                <w:szCs w:val="18"/>
+              </w:rPr>
+              <w:t>倍，方向反转）</w:t>
+            </w:r>
+            <w:r>
+              <w:rPr>
+                <w:sz w:val="18"/>
+                <w:szCs w:val="18"/>
+              </w:rPr>
+              <w:t xml:space="preserve">——H4 </w:t>
+            </w:r>
+            <w:r>
+              <w:rPr>
+                <w:sz w:val="18"/>
+                <w:szCs w:val="18"/>
+              </w:rPr>
+              <w:t>在两种口径下均被证伪且账单口径更强（见</w:t>
             </w:r>
             <w:r>
               <w:rPr>
@@ -18518,7 +18746,7 @@
           <w:noProof/>
         </w:rPr>
         <w:drawing>
-          <wp:inline distT="0" distB="0" distL="0" distR="0" wp14:anchorId="24730A7C" wp14:editId="6C660725">
+          <wp:inline distT="0" distB="0" distL="0" distR="0" wp14:anchorId="2646C0E8" wp14:editId="0363416D">
             <wp:extent cx="4953000" cy="3438525"/>
             <wp:effectExtent l="0" t="0" r="0" b="0"/>
             <wp:docPr id="1" name="fig1_cost_quality.png" descr="图 1　成本—质量前沿（主实验）" title="图 1　成本—质量前沿（主实验）"/>
@@ -18632,7 +18860,7 @@
         <w:t xml:space="preserve"> 1.9 </w:t>
       </w:r>
       <w:r>
-        <w:t>倍成本换取</w:t>
+        <w:t>倍的牌价折算成本换取</w:t>
       </w:r>
       <w:r>
         <w:t xml:space="preserve"> 0.132 </w:t>
@@ -18650,7 +18878,19 @@
         <w:t xml:space="preserve">qwen-plus </w:t>
       </w:r>
       <w:r>
-        <w:t>占据前沿左下低成本区。纵轴为模型级加权</w:t>
+        <w:t>占据前沿左下低成本区（注：横轴为牌价折算口径；账单口径下两模型主实验支出几乎持平</w:t>
+      </w:r>
+      <w:r>
+        <w:t>——deepseek ¥0.28 vs qwen ¥0.31</w:t>
+      </w:r>
+      <w:r>
+        <w:t>，前沿形态随之改变，见</w:t>
+      </w:r>
+      <w:r>
+        <w:t xml:space="preserve"> 5.10 </w:t>
+      </w:r>
+      <w:r>
+        <w:t>节）。纵轴为模型级加权</w:t>
       </w:r>
       <w:r>
         <w:t xml:space="preserve"> QYI</w:t>
@@ -18668,7 +18908,11 @@
         <w:t xml:space="preserve"> api_cost </w:t>
       </w:r>
       <w:r>
-        <w:t>总和（元）。表</w:t>
+        <w:t>总和（元，牌</w:t>
+      </w:r>
+      <w:r>
+        <w:lastRenderedPageBreak/>
+        <w:t>价折算）。表</w:t>
       </w:r>
       <w:r>
         <w:t xml:space="preserve"> 7 </w:t>
@@ -18750,7 +18994,6 @@
           <w:sz w:val="21"/>
           <w:szCs w:val="21"/>
         </w:rPr>
-        <w:lastRenderedPageBreak/>
         <w:t>表</w:t>
       </w:r>
       <w:r>
@@ -18805,7 +19048,7 @@
           <w:sz w:val="21"/>
           <w:szCs w:val="21"/>
         </w:rPr>
-        <w:t>实验）</w:t>
+        <w:t>实验；成本列为牌价折算口径，账单实测见说明）</w:t>
       </w:r>
     </w:p>
     <w:tbl>
@@ -18824,7 +19067,7 @@
           <w:left w:w="10" w:type="dxa"/>
           <w:right w:w="10" w:type="dxa"/>
         </w:tblCellMar>
-        <w:tblLook w:val="0000" w:firstRow="0" w:lastRow="0" w:firstColumn="0" w:lastColumn="0" w:noHBand="0" w:noVBand="0"/>
+        <w:tblLook w:val="04A0" w:firstRow="1" w:lastRow="0" w:firstColumn="1" w:lastColumn="0" w:noHBand="0" w:noVBand="1"/>
       </w:tblPr>
       <w:tblGrid>
         <w:gridCol w:w="1500"/>
@@ -20255,6 +20498,93 @@
         <w:t>表</w:t>
       </w:r>
       <w:r>
+        <w:t xml:space="preserve"> 7 </w:t>
+      </w:r>
+      <w:r>
+        <w:t>成本列为牌价折算口径（</w:t>
+      </w:r>
+      <w:r>
+        <w:t xml:space="preserve">3.3 </w:t>
+      </w:r>
+      <w:r>
+        <w:t>节价格表）。账单口径对账：</w:t>
+      </w:r>
+      <w:r>
+        <w:t xml:space="preserve">360 runs </w:t>
+      </w:r>
+      <w:r>
+        <w:t>有效实验的账单分摊成本约</w:t>
+      </w:r>
+      <w:r>
+        <w:t xml:space="preserve"> ¥2.42</w:t>
+      </w:r>
+      <w:r>
+        <w:t>（按提供商内</w:t>
+      </w:r>
+      <w:r>
+        <w:t xml:space="preserve"> token </w:t>
+      </w:r>
+      <w:r>
+        <w:t>比例分摊：</w:t>
+      </w:r>
+      <w:r>
+        <w:t>deepseek ¥1.13</w:t>
+      </w:r>
+      <w:r>
+        <w:t>、</w:t>
+      </w:r>
+      <w:r>
+        <w:t>qwen ¥1.29</w:t>
+      </w:r>
+      <w:r>
+        <w:t>），加上中断重跑（</w:t>
+      </w:r>
+      <w:r>
+        <w:t>14 runs</w:t>
+      </w:r>
+      <w:r>
+        <w:t>，</w:t>
+      </w:r>
+      <w:r>
+        <w:t>¥0.16</w:t>
+      </w:r>
+      <w:r>
+        <w:t>）与冒烟测试，全周期账单合计</w:t>
+      </w:r>
+      <w:r>
+        <w:t xml:space="preserve"> ¥2.59——</w:t>
+      </w:r>
+      <w:r>
+        <w:t>牌价口径高估</w:t>
+      </w:r>
+      <w:r>
+        <w:t xml:space="preserve"> 68%</w:t>
+      </w:r>
+      <w:r>
+        <w:t>，差异来自</w:t>
+      </w:r>
+      <w:r>
+        <w:t xml:space="preserve"> flash </w:t>
+      </w:r>
+      <w:r>
+        <w:t>计费档位、闲时资费与上下文缓存三项（详见</w:t>
+      </w:r>
+      <w:r>
+        <w:t xml:space="preserve"> 3.3 </w:t>
+      </w:r>
+      <w:r>
+        <w:t>节）。</w:t>
+      </w:r>
+    </w:p>
+    <w:p>
+      <w:pPr>
+        <w:spacing w:line="360" w:lineRule="auto"/>
+        <w:ind w:firstLine="480"/>
+      </w:pPr>
+      <w:r>
+        <w:t>表</w:t>
+      </w:r>
+      <w:r>
         <w:t xml:space="preserve"> 8 </w:t>
       </w:r>
       <w:r>
@@ -20388,7 +20718,7 @@
           <w:sz w:val="21"/>
           <w:szCs w:val="21"/>
         </w:rPr>
-        <w:t>；元为该组</w:t>
+        <w:t>；成本列为该组牌价折算</w:t>
       </w:r>
       <w:r>
         <w:rPr>
@@ -20425,7 +20755,7 @@
           <w:left w:w="10" w:type="dxa"/>
           <w:right w:w="10" w:type="dxa"/>
         </w:tblCellMar>
-        <w:tblLook w:val="0000" w:firstRow="0" w:lastRow="0" w:firstColumn="0" w:lastColumn="0" w:noHBand="0" w:noVBand="0"/>
+        <w:tblLook w:val="04A0" w:firstRow="1" w:lastRow="0" w:firstColumn="1" w:lastColumn="0" w:noHBand="0" w:noVBand="1"/>
       </w:tblPr>
       <w:tblGrid>
         <w:gridCol w:w="1450"/>
@@ -24279,7 +24609,7 @@
       <w:pPr>
         <w:pStyle w:val="2"/>
       </w:pPr>
-      <w:bookmarkStart w:id="21" w:name="_Toc242176773"/>
+      <w:bookmarkStart w:id="21" w:name="_Toc242208882"/>
       <w:r>
         <w:t>5.3</w:t>
       </w:r>
@@ -24445,9 +24775,8 @@
         <w:rPr>
           <w:noProof/>
         </w:rPr>
-        <w:lastRenderedPageBreak/>
         <w:drawing>
-          <wp:inline distT="0" distB="0" distL="0" distR="0" wp14:anchorId="212CF6F4" wp14:editId="550AA051">
+          <wp:inline distT="0" distB="0" distL="0" distR="0" wp14:anchorId="11D1AE78" wp14:editId="341EEA17">
             <wp:extent cx="4762500" cy="3838575"/>
             <wp:effectExtent l="0" t="0" r="0" b="0"/>
             <wp:docPr id="2" name="fig3_feasible_vs_scale.png" descr="图 2　可行率随规模衰减（主实验，按模型）" title="图 2　可行率随规模衰减（主实验，按模型）"/>
@@ -24529,8 +24858,9 @@
         <w:rPr>
           <w:noProof/>
         </w:rPr>
+        <w:lastRenderedPageBreak/>
         <w:drawing>
-          <wp:inline distT="0" distB="0" distL="0" distR="0" wp14:anchorId="13B52DAD" wp14:editId="28A60F0E">
+          <wp:inline distT="0" distB="0" distL="0" distR="0" wp14:anchorId="21074C8C" wp14:editId="301068AF">
             <wp:extent cx="4762500" cy="3838575"/>
             <wp:effectExtent l="0" t="0" r="0" b="0"/>
             <wp:docPr id="3" name="fig2_gap_vs_scale.png" descr="图 3　primal gap 随规模变化（主实验，按模型）" title="图 3　primal gap 随规模变化（主实验，按模型）"/>
@@ -24633,7 +24963,6 @@
           <w:sz w:val="21"/>
           <w:szCs w:val="21"/>
         </w:rPr>
-        <w:lastRenderedPageBreak/>
         <w:t>表</w:t>
       </w:r>
       <w:r>
@@ -24725,7 +25054,7 @@
           <w:left w:w="10" w:type="dxa"/>
           <w:right w:w="10" w:type="dxa"/>
         </w:tblCellMar>
-        <w:tblLook w:val="0000" w:firstRow="0" w:lastRow="0" w:firstColumn="0" w:lastColumn="0" w:noHBand="0" w:noVBand="0"/>
+        <w:tblLook w:val="04A0" w:firstRow="1" w:lastRow="0" w:firstColumn="1" w:lastColumn="0" w:noHBand="0" w:noVBand="1"/>
       </w:tblPr>
       <w:tblGrid>
         <w:gridCol w:w="1500"/>
@@ -26288,8 +26617,9 @@
       <w:pPr>
         <w:pStyle w:val="2"/>
       </w:pPr>
-      <w:bookmarkStart w:id="22" w:name="_Toc242176774"/>
-      <w:r>
+      <w:bookmarkStart w:id="22" w:name="_Toc242208883"/>
+      <w:r>
+        <w:lastRenderedPageBreak/>
         <w:t>5.4</w:t>
       </w:r>
       <w:r>
@@ -26560,7 +26890,7 @@
           <w:left w:w="10" w:type="dxa"/>
           <w:right w:w="10" w:type="dxa"/>
         </w:tblCellMar>
-        <w:tblLook w:val="0000" w:firstRow="0" w:lastRow="0" w:firstColumn="0" w:lastColumn="0" w:noHBand="0" w:noVBand="0"/>
+        <w:tblLook w:val="04A0" w:firstRow="1" w:lastRow="0" w:firstColumn="1" w:lastColumn="0" w:noHBand="0" w:noVBand="1"/>
       </w:tblPr>
       <w:tblGrid>
         <w:gridCol w:w="1600"/>
@@ -27311,11 +27641,7 @@
         <w:t xml:space="preserve"> 1 </w:t>
       </w:r>
       <w:r>
-        <w:t>轮后完全饱和</w:t>
-      </w:r>
-      <w:r>
-        <w:lastRenderedPageBreak/>
-        <w:t>（</w:t>
+        <w:t>轮后完全饱和（</w:t>
       </w:r>
       <w:r>
         <w:t>@1=0.67=@5</w:t>
@@ -27501,7 +27827,7 @@
       <w:pPr>
         <w:pStyle w:val="2"/>
       </w:pPr>
-      <w:bookmarkStart w:id="23" w:name="_Toc242176775"/>
+      <w:bookmarkStart w:id="23" w:name="_Toc242208884"/>
       <w:r>
         <w:t>5.5</w:t>
       </w:r>
@@ -27653,6 +27979,173 @@
         <w:ind w:firstLine="480"/>
       </w:pPr>
       <w:r>
+        <w:rPr>
+          <w:b/>
+          <w:bCs/>
+        </w:rPr>
+        <w:lastRenderedPageBreak/>
+        <w:t>账单口径的稳健性复核</w:t>
+      </w:r>
+      <w:r>
+        <w:t>：上节比值按牌价表折算，而账单实测（</w:t>
+      </w:r>
+      <w:r>
+        <w:t xml:space="preserve">3.3 </w:t>
+      </w:r>
+      <w:r>
+        <w:t>节）显示两模型全周期支出几乎持平</w:t>
+      </w:r>
+      <w:r>
+        <w:t>——deepseek ¥1.30</w:t>
+      </w:r>
+      <w:r>
+        <w:t>、</w:t>
+      </w:r>
+      <w:r>
+        <w:t>qwen ¥1.29</w:t>
+      </w:r>
+      <w:r>
+        <w:t>（主实验分摊：</w:t>
+      </w:r>
+      <w:r>
+        <w:t>¥0.28 vs ¥0.31</w:t>
+      </w:r>
+      <w:r>
+        <w:t>）。以账单口径重算，</w:t>
+      </w:r>
+      <w:r>
+        <w:t xml:space="preserve">QYI/¥ </w:t>
+      </w:r>
+      <w:r>
+        <w:t>为</w:t>
+      </w:r>
+      <w:r>
+        <w:t xml:space="preserve"> deepseek 1.92</w:t>
+      </w:r>
+      <w:r>
+        <w:t>、</w:t>
+      </w:r>
+      <w:r>
+        <w:t>qwen 1.28</w:t>
+      </w:r>
+      <w:r>
+        <w:t>，比值</w:t>
+      </w:r>
+      <w:r>
+        <w:t xml:space="preserve"> </w:t>
+      </w:r>
+      <w:r>
+        <w:rPr>
+          <w:b/>
+          <w:bCs/>
+        </w:rPr>
+        <w:t>0.67×——</w:t>
+      </w:r>
+      <w:r>
+        <w:rPr>
+          <w:b/>
+          <w:bCs/>
+        </w:rPr>
+        <w:t>方向反转</w:t>
+      </w:r>
+      <w:r>
+        <w:t>：</w:t>
+      </w:r>
+      <w:r>
+        <w:t xml:space="preserve">qwen </w:t>
+      </w:r>
+      <w:r>
+        <w:t>不仅没有兑现低价优势，反而因</w:t>
+      </w:r>
+      <w:r>
+        <w:t xml:space="preserve"> QYI </w:t>
+      </w:r>
+      <w:r>
+        <w:t>更低而性价比更差。证伪在两种口径下均成立且账单口径更强，结论对价格假设稳健；其机制在于</w:t>
+      </w:r>
+      <w:r>
+        <w:t xml:space="preserve"> flash </w:t>
+      </w:r>
+      <w:r>
+        <w:t>计费档位</w:t>
+      </w:r>
+      <w:r>
+        <w:t xml:space="preserve"> + </w:t>
+      </w:r>
+      <w:r>
+        <w:t>上下文缓存抹平了两模型的单位</w:t>
+      </w:r>
+      <w:r>
+        <w:t xml:space="preserve"> token </w:t>
+      </w:r>
+      <w:r>
+        <w:t>价格差，使</w:t>
+      </w:r>
+      <w:r>
+        <w:t xml:space="preserve">“token </w:t>
+      </w:r>
+      <w:r>
+        <w:t>消耗量</w:t>
+      </w:r>
+      <w:r>
+        <w:t xml:space="preserve"> × </w:t>
+      </w:r>
+      <w:r>
+        <w:t>单价</w:t>
+      </w:r>
+      <w:r>
+        <w:t>”</w:t>
+      </w:r>
+      <w:r>
+        <w:t>中的单价项近乎对齐，而</w:t>
+      </w:r>
+      <w:r>
+        <w:t xml:space="preserve"> qwen </w:t>
+      </w:r>
+      <w:r>
+        <w:t>在消耗量（</w:t>
+      </w:r>
+      <w:r>
+        <w:t xml:space="preserve">1.7 </w:t>
+      </w:r>
+      <w:r>
+        <w:t>倍）与质量（</w:t>
+      </w:r>
+      <w:r>
+        <w:t xml:space="preserve">QYI </w:t>
+      </w:r>
+      <w:r>
+        <w:t>差</w:t>
+      </w:r>
+      <w:r>
+        <w:t xml:space="preserve"> 0.132</w:t>
+      </w:r>
+      <w:r>
+        <w:t>）上双双处于劣势。这一复核同时说明：</w:t>
+      </w:r>
+      <w:r>
+        <w:rPr>
+          <w:b/>
+          <w:bCs/>
+        </w:rPr>
+        <w:t>性价比结论对计费口径敏感</w:t>
+      </w:r>
+      <w:r>
+        <w:t>，评测报告若只按牌价表折算，可能在方向上误判</w:t>
+      </w:r>
+      <w:r>
+        <w:t>——</w:t>
+      </w:r>
+      <w:r>
+        <w:t>账单对账应成为成本报告的标准环节。</w:t>
+      </w:r>
+    </w:p>
+    <w:p>
+      <w:pPr>
+        <w:spacing w:line="360" w:lineRule="auto"/>
+        <w:ind w:firstLine="480"/>
+      </w:pPr>
+      <w:r>
         <w:t>实际图景比预登记假设更有结构：</w:t>
       </w:r>
       <w:r>
@@ -27776,7 +28269,7 @@
       <w:pPr>
         <w:pStyle w:val="2"/>
       </w:pPr>
-      <w:bookmarkStart w:id="24" w:name="_Toc242176776"/>
+      <w:bookmarkStart w:id="24" w:name="_Toc242208885"/>
       <w:r>
         <w:t>5.6</w:t>
       </w:r>
@@ -27940,11 +28433,7 @@
         <w:t>波动可控</w:t>
       </w:r>
       <w:r>
-        <w:t>：可行实例的组内</w:t>
-      </w:r>
-      <w:r>
-        <w:lastRenderedPageBreak/>
-        <w:t>变异系数普遍</w:t>
+        <w:t>：可行实例的组内变异系数普遍</w:t>
       </w:r>
       <w:r>
         <w:t xml:space="preserve"> &lt;0.35</w:t>
@@ -27993,8 +28482,9 @@
         <w:rPr>
           <w:noProof/>
         </w:rPr>
+        <w:lastRenderedPageBreak/>
         <w:drawing>
-          <wp:inline distT="0" distB="0" distL="0" distR="0" wp14:anchorId="059C5153" wp14:editId="58E88A55">
+          <wp:inline distT="0" distB="0" distL="0" distR="0" wp14:anchorId="008CC28B" wp14:editId="330FEE1E">
             <wp:extent cx="4762500" cy="4200525"/>
             <wp:effectExtent l="0" t="0" r="0" b="0"/>
             <wp:docPr id="4" name="fig4_stability.png" descr="图 4　稳定性（稳定性实验，270 runs）：primal gap 的实例内变异系数" title="图 4　稳定性（稳定性实验，270 runs）：primal gap 的实例内变异系数"/>
@@ -28311,7 +28801,7 @@
           <w:left w:w="10" w:type="dxa"/>
           <w:right w:w="10" w:type="dxa"/>
         </w:tblCellMar>
-        <w:tblLook w:val="0000" w:firstRow="0" w:lastRow="0" w:firstColumn="0" w:lastColumn="0" w:noHBand="0" w:noVBand="0"/>
+        <w:tblLook w:val="04A0" w:firstRow="1" w:lastRow="0" w:firstColumn="1" w:lastColumn="0" w:noHBand="0" w:noVBand="1"/>
       </w:tblPr>
       <w:tblGrid>
         <w:gridCol w:w="1450"/>
@@ -30092,7 +30582,6 @@
                 <w:sz w:val="18"/>
                 <w:szCs w:val="18"/>
               </w:rPr>
-              <w:lastRenderedPageBreak/>
               <w:t>qwen-plus</w:t>
             </w:r>
           </w:p>
@@ -31796,7 +32285,7 @@
           <w:left w:w="10" w:type="dxa"/>
           <w:right w:w="10" w:type="dxa"/>
         </w:tblCellMar>
-        <w:tblLook w:val="0000" w:firstRow="0" w:lastRow="0" w:firstColumn="0" w:lastColumn="0" w:noHBand="0" w:noVBand="0"/>
+        <w:tblLook w:val="04A0" w:firstRow="1" w:lastRow="0" w:firstColumn="1" w:lastColumn="0" w:noHBand="0" w:noVBand="1"/>
       </w:tblPr>
       <w:tblGrid>
         <w:gridCol w:w="1500"/>
@@ -33105,7 +33594,7 @@
       <w:pPr>
         <w:pStyle w:val="2"/>
       </w:pPr>
-      <w:bookmarkStart w:id="25" w:name="_Toc242176777"/>
+      <w:bookmarkStart w:id="25" w:name="_Toc242208886"/>
       <w:r>
         <w:t>5.7</w:t>
       </w:r>
@@ -33219,11 +33708,7 @@
         <w:t>为主要失败类、</w:t>
       </w:r>
       <w:r>
-        <w:t xml:space="preserve">CO-Bench“struggle </w:t>
-      </w:r>
-      <w:r>
-        <w:lastRenderedPageBreak/>
-        <w:t>to ensure feasibility”</w:t>
+        <w:t>CO-Bench“struggle to ensure feasibility”</w:t>
       </w:r>
       <w:r>
         <w:t>的领域共识同构</w:t>
@@ -33256,7 +33741,11 @@
         <w:t>占</w:t>
       </w:r>
       <w:r>
-        <w:t xml:space="preserve"> 113</w:t>
+        <w:t xml:space="preserve"> </w:t>
+      </w:r>
+      <w:r>
+        <w:lastRenderedPageBreak/>
+        <w:t>113</w:t>
       </w:r>
       <w:r>
         <w:t>（</w:t>
@@ -33297,7 +33786,7 @@
           <w:noProof/>
         </w:rPr>
         <w:drawing>
-          <wp:inline distT="0" distB="0" distL="0" distR="0" wp14:anchorId="6C0FCD05" wp14:editId="35393978">
+          <wp:inline distT="0" distB="0" distL="0" distR="0" wp14:anchorId="052EC168" wp14:editId="6DBE5CDA">
             <wp:extent cx="4667250" cy="4467225"/>
             <wp:effectExtent l="0" t="0" r="0" b="0"/>
             <wp:docPr id="5" name="fig5_failure_modes.png" descr="图 5　失败模式分布（主实验 + 稳定性实验，按模型堆叠）" title="图 5　失败模式分布（主实验 + 稳定性实验，按模型堆叠）"/>
@@ -33491,7 +33980,7 @@
           <w:left w:w="10" w:type="dxa"/>
           <w:right w:w="10" w:type="dxa"/>
         </w:tblCellMar>
-        <w:tblLook w:val="0000" w:firstRow="0" w:lastRow="0" w:firstColumn="0" w:lastColumn="0" w:noHBand="0" w:noVBand="0"/>
+        <w:tblLook w:val="04A0" w:firstRow="1" w:lastRow="0" w:firstColumn="1" w:lastColumn="0" w:noHBand="0" w:noVBand="1"/>
       </w:tblPr>
       <w:tblGrid>
         <w:gridCol w:w="1500"/>
@@ -34671,23 +35160,23 @@
         <w:t>”</w:t>
       </w:r>
       <w:r>
-        <w:t>要通过更紧的档位</w:t>
+        <w:t>要通过更紧的档位才能检验</w:t>
+      </w:r>
+      <w:r>
+        <w:t>——</w:t>
+      </w:r>
+      <w:r>
+        <w:t>这正是被裁剪的预算档位实验（原</w:t>
+      </w:r>
+      <w:r>
+        <w:t xml:space="preserve"> H3</w:t>
+      </w:r>
+      <w:r>
+        <w:t>）要回答的问题，留作后续</w:t>
       </w:r>
       <w:r>
         <w:lastRenderedPageBreak/>
-        <w:t>才能检验</w:t>
-      </w:r>
-      <w:r>
-        <w:t>——</w:t>
-      </w:r>
-      <w:r>
-        <w:t>这正是被裁剪的预算档位实验（原</w:t>
-      </w:r>
-      <w:r>
-        <w:t xml:space="preserve"> H3</w:t>
-      </w:r>
-      <w:r>
-        <w:t>）要回答的问题，留作后续工作。</w:t>
+        <w:t>工作。</w:t>
       </w:r>
       <w:r>
         <w:t xml:space="preserve">F4 </w:t>
@@ -34712,7 +35201,7 @@
       <w:pPr>
         <w:pStyle w:val="2"/>
       </w:pPr>
-      <w:bookmarkStart w:id="26" w:name="_Toc242176778"/>
+      <w:bookmarkStart w:id="26" w:name="_Toc242208887"/>
       <w:r>
         <w:t>5.8</w:t>
       </w:r>
@@ -34995,7 +35484,7 @@
       <w:pPr>
         <w:pStyle w:val="2"/>
       </w:pPr>
-      <w:bookmarkStart w:id="27" w:name="_Toc242176779"/>
+      <w:bookmarkStart w:id="27" w:name="_Toc242208888"/>
       <w:r>
         <w:t>5.9</w:t>
       </w:r>
@@ -35217,7 +35706,7 @@
           <w:left w:w="10" w:type="dxa"/>
           <w:right w:w="10" w:type="dxa"/>
         </w:tblCellMar>
-        <w:tblLook w:val="0000" w:firstRow="0" w:lastRow="0" w:firstColumn="0" w:lastColumn="0" w:noHBand="0" w:noVBand="0"/>
+        <w:tblLook w:val="04A0" w:firstRow="1" w:lastRow="0" w:firstColumn="1" w:lastColumn="0" w:noHBand="0" w:noVBand="1"/>
       </w:tblPr>
       <w:tblGrid>
         <w:gridCol w:w="1800"/>
@@ -36653,7 +37142,6 @@
                 <w:sz w:val="18"/>
                 <w:szCs w:val="18"/>
               </w:rPr>
-              <w:lastRenderedPageBreak/>
               <w:t>调度</w:t>
             </w:r>
             <w:r>
@@ -36969,6 +37457,7 @@
         <w:ind w:firstLine="480"/>
       </w:pPr>
       <w:r>
+        <w:lastRenderedPageBreak/>
         <w:t>这一结果与领域文献的结论链一致：</w:t>
       </w:r>
       <w:r>
@@ -37075,7 +37564,7 @@
       <w:pPr>
         <w:pStyle w:val="2"/>
       </w:pPr>
-      <w:bookmarkStart w:id="28" w:name="_Toc242176780"/>
+      <w:bookmarkStart w:id="28" w:name="_Toc242208889"/>
       <w:r>
         <w:t>5.10</w:t>
       </w:r>
@@ -37102,19 +37591,25 @@
         <w:t xml:space="preserve"> 5.2 </w:t>
       </w:r>
       <w:r>
-        <w:t>节的总量按</w:t>
-      </w:r>
-      <w:r>
-        <w:t xml:space="preserve"> 3.3 </w:t>
-      </w:r>
-      <w:r>
-        <w:t>节价格口径折算为四个单位口径：单</w:t>
+        <w:t>节的总量折算为四个单位口径：单</w:t>
       </w:r>
       <w:r>
         <w:t xml:space="preserve"> run </w:t>
       </w:r>
       <w:r>
-        <w:t>成本、每可行解成本、成本集中度与调用强度。</w:t>
+        <w:t>成本、每可行解成本、成本集中度与调用强度；每个成本指标同时给出牌价折算口径（预登记口径，</w:t>
+      </w:r>
+      <w:r>
+        <w:t xml:space="preserve">3.3 </w:t>
+      </w:r>
+      <w:r>
+        <w:t>节价格表）与账单分摊口径（按提供商内</w:t>
+      </w:r>
+      <w:r>
+        <w:t xml:space="preserve"> token </w:t>
+      </w:r>
+      <w:r>
+        <w:t>比例分摊账单实测值）。</w:t>
       </w:r>
     </w:p>
     <w:p>
@@ -37166,7 +37661,7 @@
           <w:sz w:val="21"/>
           <w:szCs w:val="21"/>
         </w:rPr>
-        <w:t>；成本按</w:t>
+        <w:t>；牌价</w:t>
       </w:r>
       <w:r>
         <w:rPr>
@@ -37175,7 +37670,7 @@
           <w:sz w:val="21"/>
           <w:szCs w:val="21"/>
         </w:rPr>
-        <w:t xml:space="preserve"> 3.3 </w:t>
+        <w:t xml:space="preserve"> = 3.3 </w:t>
       </w:r>
       <w:r>
         <w:rPr>
@@ -37184,7 +37679,43 @@
           <w:sz w:val="21"/>
           <w:szCs w:val="21"/>
         </w:rPr>
-        <w:t>节价格口径折算）</w:t>
+        <w:t>节价格表折算，账单</w:t>
+      </w:r>
+      <w:r>
+        <w:rPr>
+          <w:b/>
+          <w:bCs/>
+          <w:sz w:val="21"/>
+          <w:szCs w:val="21"/>
+        </w:rPr>
+        <w:t xml:space="preserve"> = </w:t>
+      </w:r>
+      <w:r>
+        <w:rPr>
+          <w:b/>
+          <w:bCs/>
+          <w:sz w:val="21"/>
+          <w:szCs w:val="21"/>
+        </w:rPr>
+        <w:t>账单实测按</w:t>
+      </w:r>
+      <w:r>
+        <w:rPr>
+          <w:b/>
+          <w:bCs/>
+          <w:sz w:val="21"/>
+          <w:szCs w:val="21"/>
+        </w:rPr>
+        <w:t xml:space="preserve"> token </w:t>
+      </w:r>
+      <w:r>
+        <w:rPr>
+          <w:b/>
+          <w:bCs/>
+          <w:sz w:val="21"/>
+          <w:szCs w:val="21"/>
+        </w:rPr>
+        <w:t>比例分摊）</w:t>
       </w:r>
     </w:p>
     <w:tbl>
@@ -37203,7 +37734,7 @@
           <w:left w:w="10" w:type="dxa"/>
           <w:right w:w="10" w:type="dxa"/>
         </w:tblCellMar>
-        <w:tblLook w:val="0000" w:firstRow="0" w:lastRow="0" w:firstColumn="0" w:lastColumn="0" w:noHBand="0" w:noVBand="0"/>
+        <w:tblLook w:val="04A0" w:firstRow="1" w:lastRow="0" w:firstColumn="1" w:lastColumn="0" w:noHBand="0" w:noVBand="1"/>
       </w:tblPr>
       <w:tblGrid>
         <w:gridCol w:w="1250"/>
@@ -37438,7 +37969,35 @@
                 <w:sz w:val="18"/>
                 <w:szCs w:val="18"/>
               </w:rPr>
-              <w:t>¥0.0156</w:t>
+              <w:t>牌价</w:t>
+            </w:r>
+            <w:r>
+              <w:rPr>
+                <w:sz w:val="18"/>
+                <w:szCs w:val="18"/>
+              </w:rPr>
+              <w:t xml:space="preserve"> ¥0.0156</w:t>
+            </w:r>
+            <w:r>
+              <w:rPr>
+                <w:sz w:val="18"/>
+                <w:szCs w:val="18"/>
+              </w:rPr>
+              <w:br/>
+            </w:r>
+            <w:r>
+              <w:rPr>
+                <w:sz w:val="18"/>
+                <w:szCs w:val="18"/>
+              </w:rPr>
+              <w:t>账单</w:t>
+            </w:r>
+            <w:r>
+              <w:rPr>
+                <w:sz w:val="18"/>
+                <w:szCs w:val="18"/>
+              </w:rPr>
+              <w:t xml:space="preserve"> ¥0.0061</w:t>
             </w:r>
           </w:p>
         </w:tc>
@@ -37469,7 +38028,35 @@
                 <w:sz w:val="18"/>
                 <w:szCs w:val="18"/>
               </w:rPr>
-              <w:t>¥0.0080</w:t>
+              <w:t>牌价</w:t>
+            </w:r>
+            <w:r>
+              <w:rPr>
+                <w:sz w:val="18"/>
+                <w:szCs w:val="18"/>
+              </w:rPr>
+              <w:t xml:space="preserve"> ¥0.0080</w:t>
+            </w:r>
+            <w:r>
+              <w:rPr>
+                <w:sz w:val="18"/>
+                <w:szCs w:val="18"/>
+              </w:rPr>
+              <w:br/>
+            </w:r>
+            <w:r>
+              <w:rPr>
+                <w:sz w:val="18"/>
+                <w:szCs w:val="18"/>
+              </w:rPr>
+              <w:t>账单</w:t>
+            </w:r>
+            <w:r>
+              <w:rPr>
+                <w:sz w:val="18"/>
+                <w:szCs w:val="18"/>
+              </w:rPr>
+              <w:t xml:space="preserve"> ¥0.0069</w:t>
             </w:r>
           </w:p>
         </w:tc>
@@ -37499,21 +38086,35 @@
                 <w:sz w:val="18"/>
                 <w:szCs w:val="18"/>
               </w:rPr>
-              <w:t>稳定性实验分别为</w:t>
-            </w:r>
-            <w:r>
-              <w:rPr>
-                <w:sz w:val="18"/>
-                <w:szCs w:val="18"/>
-              </w:rPr>
-              <w:t xml:space="preserve"> ¥0.0159 / ¥0.0086——</w:t>
-            </w:r>
-            <w:r>
-              <w:rPr>
-                <w:sz w:val="18"/>
-                <w:szCs w:val="18"/>
-              </w:rPr>
-              <w:t>两次独立实验互相印证，口径稳定</w:t>
+              <w:t>账单口径下两者趋同（</w:t>
+            </w:r>
+            <w:r>
+              <w:rPr>
+                <w:sz w:val="18"/>
+                <w:szCs w:val="18"/>
+              </w:rPr>
+              <w:t xml:space="preserve">deepseek </w:t>
+            </w:r>
+            <w:r>
+              <w:rPr>
+                <w:sz w:val="18"/>
+                <w:szCs w:val="18"/>
+              </w:rPr>
+              <w:t>反而略低）；稳定性实验账单口径</w:t>
+            </w:r>
+            <w:r>
+              <w:rPr>
+                <w:sz w:val="18"/>
+                <w:szCs w:val="18"/>
+              </w:rPr>
+              <w:t xml:space="preserve"> ¥0.0064 / ¥0.0073——</w:t>
+            </w:r>
+            <w:r>
+              <w:rPr>
+                <w:sz w:val="18"/>
+                <w:szCs w:val="18"/>
+              </w:rPr>
+              <w:t>两次独立实验互相印证</w:t>
             </w:r>
           </w:p>
         </w:tc>
@@ -37585,7 +38186,35 @@
                 <w:sz w:val="18"/>
                 <w:szCs w:val="18"/>
               </w:rPr>
-              <w:t>¥0.026</w:t>
+              <w:t>牌价</w:t>
+            </w:r>
+            <w:r>
+              <w:rPr>
+                <w:sz w:val="18"/>
+                <w:szCs w:val="18"/>
+              </w:rPr>
+              <w:t xml:space="preserve"> ¥0.026</w:t>
+            </w:r>
+            <w:r>
+              <w:rPr>
+                <w:sz w:val="18"/>
+                <w:szCs w:val="18"/>
+              </w:rPr>
+              <w:br/>
+            </w:r>
+            <w:r>
+              <w:rPr>
+                <w:sz w:val="18"/>
+                <w:szCs w:val="18"/>
+              </w:rPr>
+              <w:t>账单</w:t>
+            </w:r>
+            <w:r>
+              <w:rPr>
+                <w:sz w:val="18"/>
+                <w:szCs w:val="18"/>
+              </w:rPr>
+              <w:t xml:space="preserve"> ¥0.010</w:t>
             </w:r>
           </w:p>
         </w:tc>
@@ -37616,7 +38245,35 @@
                 <w:sz w:val="18"/>
                 <w:szCs w:val="18"/>
               </w:rPr>
-              <w:t>¥0.016</w:t>
+              <w:t>牌价</w:t>
+            </w:r>
+            <w:r>
+              <w:rPr>
+                <w:sz w:val="18"/>
+                <w:szCs w:val="18"/>
+              </w:rPr>
+              <w:t xml:space="preserve"> ¥0.016</w:t>
+            </w:r>
+            <w:r>
+              <w:rPr>
+                <w:sz w:val="18"/>
+                <w:szCs w:val="18"/>
+              </w:rPr>
+              <w:br/>
+            </w:r>
+            <w:r>
+              <w:rPr>
+                <w:sz w:val="18"/>
+                <w:szCs w:val="18"/>
+              </w:rPr>
+              <w:t>账单</w:t>
+            </w:r>
+            <w:r>
+              <w:rPr>
+                <w:sz w:val="18"/>
+                <w:szCs w:val="18"/>
+              </w:rPr>
+              <w:t xml:space="preserve"> ¥0.014</w:t>
             </w:r>
           </w:p>
         </w:tc>
@@ -37646,28 +38303,63 @@
                 <w:sz w:val="18"/>
                 <w:szCs w:val="18"/>
               </w:rPr>
-              <w:t xml:space="preserve">0.70÷27 </w:t>
-            </w:r>
-            <w:r>
-              <w:rPr>
-                <w:sz w:val="18"/>
-                <w:szCs w:val="18"/>
-              </w:rPr>
-              <w:t>与</w:t>
-            </w:r>
-            <w:r>
-              <w:rPr>
-                <w:sz w:val="18"/>
-                <w:szCs w:val="18"/>
-              </w:rPr>
-              <w:t xml:space="preserve"> 0.36÷22</w:t>
-            </w:r>
-            <w:r>
-              <w:rPr>
-                <w:sz w:val="18"/>
-                <w:szCs w:val="18"/>
-              </w:rPr>
-              <w:t>；</w:t>
+              <w:t>牌价口径</w:t>
+            </w:r>
+            <w:r>
+              <w:rPr>
+                <w:sz w:val="18"/>
+                <w:szCs w:val="18"/>
+              </w:rPr>
+              <w:t xml:space="preserve"> qwen </w:t>
+            </w:r>
+            <w:r>
+              <w:rPr>
+                <w:sz w:val="18"/>
+                <w:szCs w:val="18"/>
+              </w:rPr>
+              <w:t>便宜</w:t>
+            </w:r>
+            <w:r>
+              <w:rPr>
+                <w:sz w:val="18"/>
+                <w:szCs w:val="18"/>
+              </w:rPr>
+              <w:t xml:space="preserve"> 1.58×</w:t>
+            </w:r>
+            <w:r>
+              <w:rPr>
+                <w:sz w:val="18"/>
+                <w:szCs w:val="18"/>
+              </w:rPr>
+              <w:t>；账单口径</w:t>
+            </w:r>
+            <w:r>
+              <w:rPr>
+                <w:sz w:val="18"/>
+                <w:szCs w:val="18"/>
+              </w:rPr>
+              <w:t xml:space="preserve"> deepseek </w:t>
+            </w:r>
+            <w:r>
+              <w:rPr>
+                <w:sz w:val="18"/>
+                <w:szCs w:val="18"/>
+              </w:rPr>
+              <w:t>便宜</w:t>
+            </w:r>
+            <w:r>
+              <w:rPr>
+                <w:sz w:val="18"/>
+                <w:szCs w:val="18"/>
+              </w:rPr>
+              <w:t xml:space="preserve"> 1.38×——</w:t>
+            </w:r>
+            <w:r>
+              <w:rPr>
+                <w:sz w:val="18"/>
+                <w:szCs w:val="18"/>
+              </w:rPr>
+              <w:t>计入口径后排序反转，</w:t>
             </w:r>
             <w:r>
               <w:rPr>
@@ -37681,63 +38373,21 @@
                 <w:sz w:val="18"/>
                 <w:szCs w:val="18"/>
               </w:rPr>
-              <w:t>便宜</w:t>
-            </w:r>
-            <w:r>
-              <w:rPr>
-                <w:sz w:val="18"/>
-                <w:szCs w:val="18"/>
-              </w:rPr>
-              <w:t xml:space="preserve"> 1.58×</w:t>
-            </w:r>
-            <w:r>
-              <w:rPr>
-                <w:sz w:val="18"/>
-                <w:szCs w:val="18"/>
-              </w:rPr>
-              <w:t>，计入可行解质量差（</w:t>
-            </w:r>
-            <w:r>
-              <w:rPr>
-                <w:sz w:val="18"/>
-                <w:szCs w:val="18"/>
-              </w:rPr>
-              <w:t>gap 0.21 vs 0.32</w:t>
-            </w:r>
-            <w:r>
-              <w:rPr>
-                <w:sz w:val="18"/>
-                <w:szCs w:val="18"/>
-              </w:rPr>
-              <w:t>）后每单位</w:t>
-            </w:r>
-            <w:r>
-              <w:rPr>
-                <w:sz w:val="18"/>
-                <w:szCs w:val="18"/>
-              </w:rPr>
-              <w:t xml:space="preserve"> QYI </w:t>
-            </w:r>
-            <w:r>
-              <w:rPr>
-                <w:sz w:val="18"/>
-                <w:szCs w:val="18"/>
-              </w:rPr>
-              <w:t>便宜</w:t>
-            </w:r>
-            <w:r>
-              <w:rPr>
-                <w:sz w:val="18"/>
-                <w:szCs w:val="18"/>
-              </w:rPr>
-              <w:t xml:space="preserve"> 1.45×——</w:t>
-            </w:r>
-            <w:r>
-              <w:rPr>
-                <w:sz w:val="18"/>
-                <w:szCs w:val="18"/>
-              </w:rPr>
-              <w:t>质量溢价缩小但不逆转排序</w:t>
+              <w:t>的高失败率（</w:t>
+            </w:r>
+            <w:r>
+              <w:rPr>
+                <w:sz w:val="18"/>
+                <w:szCs w:val="18"/>
+              </w:rPr>
+              <w:t xml:space="preserve">22 vs 27 </w:t>
+            </w:r>
+            <w:r>
+              <w:rPr>
+                <w:sz w:val="18"/>
+                <w:szCs w:val="18"/>
+              </w:rPr>
+              <w:t>个可行解）吞掉全部价格优势</w:t>
             </w:r>
           </w:p>
         </w:tc>
@@ -37823,7 +38473,7 @@
                 <w:sz w:val="18"/>
                 <w:szCs w:val="18"/>
               </w:rPr>
-              <w:t xml:space="preserve"> 64.7%</w:t>
+              <w:t xml:space="preserve"> 58%</w:t>
             </w:r>
           </w:p>
         </w:tc>
@@ -37868,7 +38518,7 @@
                 <w:sz w:val="18"/>
                 <w:szCs w:val="18"/>
               </w:rPr>
-              <w:t xml:space="preserve"> 45.0%</w:t>
+              <w:t xml:space="preserve"> 44%</w:t>
             </w:r>
           </w:p>
         </w:tc>
@@ -37898,6 +38548,34 @@
                 <w:sz w:val="18"/>
                 <w:szCs w:val="18"/>
               </w:rPr>
+              <w:t xml:space="preserve">token </w:t>
+            </w:r>
+            <w:r>
+              <w:rPr>
+                <w:sz w:val="18"/>
+                <w:szCs w:val="18"/>
+              </w:rPr>
+              <w:t>口径（</w:t>
+            </w:r>
+            <w:r>
+              <w:rPr>
+                <w:sz w:val="18"/>
+                <w:szCs w:val="18"/>
+              </w:rPr>
+              <w:t>100,444 / 127,801 tokens</w:t>
+            </w:r>
+            <w:r>
+              <w:rPr>
+                <w:sz w:val="18"/>
+                <w:szCs w:val="18"/>
+              </w:rPr>
+              <w:t>）；</w:t>
+            </w:r>
+            <w:r>
+              <w:rPr>
+                <w:sz w:val="18"/>
+                <w:szCs w:val="18"/>
+              </w:rPr>
               <w:t xml:space="preserve">deepseek </w:t>
             </w:r>
             <w:r>
@@ -37905,35 +38583,7 @@
                 <w:sz w:val="18"/>
                 <w:szCs w:val="18"/>
               </w:rPr>
-              <w:t>的</w:t>
-            </w:r>
-            <w:r>
-              <w:rPr>
-                <w:sz w:val="18"/>
-                <w:szCs w:val="18"/>
-              </w:rPr>
-              <w:t xml:space="preserve"> ¥0.453</w:t>
-            </w:r>
-            <w:r>
-              <w:rPr>
-                <w:sz w:val="18"/>
-                <w:szCs w:val="18"/>
-              </w:rPr>
-              <w:t>（</w:t>
-            </w:r>
-            <w:r>
-              <w:rPr>
-                <w:sz w:val="18"/>
-                <w:szCs w:val="18"/>
-              </w:rPr>
-              <w:t>100,444 tokens</w:t>
-            </w:r>
-            <w:r>
-              <w:rPr>
-                <w:sz w:val="18"/>
-                <w:szCs w:val="18"/>
-              </w:rPr>
-              <w:t>）花在</w:t>
+              <w:t>该组</w:t>
             </w:r>
             <w:r>
               <w:rPr>
@@ -37961,7 +38611,7 @@
                 <w:sz w:val="18"/>
                 <w:szCs w:val="18"/>
               </w:rPr>
-              <w:t>个可行解的组上</w:t>
+              <w:t>个可行解</w:t>
             </w:r>
             <w:r>
               <w:rPr>
@@ -38250,7 +38900,7 @@
         <w:t xml:space="preserve"> qwen </w:t>
       </w:r>
       <w:r>
-        <w:t>的单价优势（约为</w:t>
+        <w:t>的牌价单价优势（约为</w:t>
       </w:r>
       <w:r>
         <w:t xml:space="preserve"> deepseek </w:t>
@@ -38262,19 +38912,55 @@
         <w:t xml:space="preserve"> 1/3—1/4</w:t>
       </w:r>
       <w:r>
-        <w:t>）只能兑现成</w:t>
+        <w:t>）无法兑现：它无法靠少输出来省钱，而高失败率迫使它多轮重试（调用强度</w:t>
+      </w:r>
+      <w:r>
+        <w:t xml:space="preserve"> 3.33 vs 2.69</w:t>
+      </w:r>
+      <w:r>
+        <w:t>），输入侧反而更贵</w:t>
+      </w:r>
+      <w:r>
+        <w:t>——</w:t>
+      </w:r>
+      <w:r>
+        <w:t>牌价口径下尚剩</w:t>
       </w:r>
       <w:r>
         <w:t xml:space="preserve"> 1.45× </w:t>
       </w:r>
       <w:r>
-        <w:t>的性价比：它无法靠少输出来省钱，而高失败率迫使它多轮重试（调用强度</w:t>
-      </w:r>
-      <w:r>
-        <w:t xml:space="preserve"> 3.33 vs 2.69</w:t>
-      </w:r>
-      <w:r>
-        <w:t>），输入侧反而更贵。</w:t>
+        <w:t>的账面性价比，账单口径下（</w:t>
+      </w:r>
+      <w:r>
+        <w:t xml:space="preserve">flash </w:t>
+      </w:r>
+      <w:r>
+        <w:t>档位</w:t>
+      </w:r>
+      <w:r>
+        <w:t xml:space="preserve"> + </w:t>
+      </w:r>
+      <w:r>
+        <w:t>上下文缓存抹平单价差）连这</w:t>
+      </w:r>
+      <w:r>
+        <w:t xml:space="preserve"> 1.45× </w:t>
+      </w:r>
+      <w:r>
+        <w:t>也归零反转（</w:t>
+      </w:r>
+      <w:r>
+        <w:t>0.67×</w:t>
+      </w:r>
+      <w:r>
+        <w:t>，见</w:t>
+      </w:r>
+      <w:r>
+        <w:t xml:space="preserve"> 5.5 </w:t>
+      </w:r>
+      <w:r>
+        <w:t>节）。</w:t>
       </w:r>
       <w:r>
         <w:rPr>
@@ -38287,10 +38973,16 @@
         <w:t>：</w:t>
       </w:r>
       <w:r>
-        <w:t xml:space="preserve">deepseek-chat 65% </w:t>
-      </w:r>
-      <w:r>
-        <w:t>的主实验成本消耗在单一组（</w:t>
+        <w:t xml:space="preserve">deepseek-chat 58% </w:t>
+      </w:r>
+      <w:r>
+        <w:t>的主实验</w:t>
+      </w:r>
+      <w:r>
+        <w:t xml:space="preserve"> token </w:t>
+      </w:r>
+      <w:r>
+        <w:t>消耗在单一组（</w:t>
       </w:r>
       <w:r>
         <w:t>TSP large</w:t>
@@ -38302,6 +38994,7 @@
         <w:t xml:space="preserve"> 5 runs </w:t>
       </w:r>
       <w:r>
+        <w:lastRenderedPageBreak/>
         <w:t>仅产出</w:t>
       </w:r>
       <w:r>
@@ -38334,22 +39027,14 @@
           <w:b/>
           <w:bCs/>
         </w:rPr>
-        <w:t xml:space="preserve"> 4.6 </w:t>
+        <w:t xml:space="preserve"> 7.7 </w:t>
       </w:r>
       <w:r>
         <w:rPr>
           <w:b/>
           <w:bCs/>
         </w:rPr>
-        <w:t>倍差</w:t>
-      </w:r>
-      <w:r>
-        <w:rPr>
-          <w:b/>
-          <w:bCs/>
-        </w:rPr>
-        <w:lastRenderedPageBreak/>
-        <w:t>距</w:t>
+        <w:t>倍差距</w:t>
       </w:r>
       <w:r>
         <w:t>：事前按</w:t>
@@ -38358,10 +39043,10 @@
         <w:t xml:space="preserve"> ¥20 </w:t>
       </w:r>
       <w:r>
-        <w:t>登记、实测</w:t>
-      </w:r>
-      <w:r>
-        <w:t xml:space="preserve"> ¥4.36</w:t>
+        <w:t>登记、账单实测</w:t>
+      </w:r>
+      <w:r>
+        <w:t xml:space="preserve"> ¥2.59</w:t>
       </w:r>
       <w:r>
         <w:t>；折算到</w:t>
@@ -38376,13 +39061,16 @@
         <w:t xml:space="preserve"> ¥0.056/run</w:t>
       </w:r>
       <w:r>
-        <w:t>，实测均值</w:t>
-      </w:r>
-      <w:r>
-        <w:t xml:space="preserve"> ¥0.012/run</w:t>
-      </w:r>
-      <w:r>
-        <w:t>。评测者登记预算时应同时给出</w:t>
+        <w:t>，账单实测约</w:t>
+      </w:r>
+      <w:r>
+        <w:t xml:space="preserve"> ¥0.007/run</w:t>
+      </w:r>
+      <w:r>
+        <w:t>。评测者登记预算时</w:t>
+      </w:r>
+      <w:r>
+        <w:t>应同时给出</w:t>
       </w:r>
       <w:r>
         <w:t>“</w:t>
@@ -38432,7 +39120,7 @@
         <w:pStyle w:val="1"/>
         <w:pageBreakBefore/>
       </w:pPr>
-      <w:bookmarkStart w:id="29" w:name="_Toc242176781"/>
+      <w:bookmarkStart w:id="29" w:name="_Toc242208890"/>
       <w:r>
         <w:lastRenderedPageBreak/>
         <w:t>6</w:t>
@@ -38446,7 +39134,7 @@
       <w:pPr>
         <w:pStyle w:val="2"/>
       </w:pPr>
-      <w:bookmarkStart w:id="30" w:name="_Toc242176782"/>
+      <w:bookmarkStart w:id="30" w:name="_Toc242208891"/>
       <w:r>
         <w:t>6.1</w:t>
       </w:r>
@@ -38675,7 +39363,7 @@
       <w:pPr>
         <w:pStyle w:val="2"/>
       </w:pPr>
-      <w:bookmarkStart w:id="31" w:name="_Toc242176783"/>
+      <w:bookmarkStart w:id="31" w:name="_Toc242208892"/>
       <w:r>
         <w:t>6.2</w:t>
       </w:r>
@@ -38796,7 +39484,7 @@
       <w:pPr>
         <w:pStyle w:val="2"/>
       </w:pPr>
-      <w:bookmarkStart w:id="32" w:name="_Toc242176784"/>
+      <w:bookmarkStart w:id="32" w:name="_Toc242208893"/>
       <w:r>
         <w:t>6.3</w:t>
       </w:r>
@@ -39495,7 +40183,7 @@
       <w:pPr>
         <w:pStyle w:val="2"/>
       </w:pPr>
-      <w:bookmarkStart w:id="33" w:name="_Toc242176785"/>
+      <w:bookmarkStart w:id="33" w:name="_Toc242208894"/>
       <w:r>
         <w:t>6.4</w:t>
       </w:r>
@@ -39789,7 +40477,7 @@
       <w:pPr>
         <w:pStyle w:val="2"/>
       </w:pPr>
-      <w:bookmarkStart w:id="34" w:name="_Toc242176786"/>
+      <w:bookmarkStart w:id="34" w:name="_Toc242208895"/>
       <w:r>
         <w:t>6.5</w:t>
       </w:r>
@@ -39845,13 +40533,19 @@
         <w:t xml:space="preserve"> F5 </w:t>
       </w:r>
       <w:r>
-        <w:t>从零实测变成有变化的分布；配置模板已留档，增量成本约</w:t>
-      </w:r>
-      <w:r>
-        <w:t xml:space="preserve"> ¥5 </w:t>
-      </w:r>
-      <w:r>
-        <w:t>量级。</w:t>
+        <w:t>从零实测变成有变化的分布；配置模板已留档，增量成本按账单口径不足</w:t>
+      </w:r>
+      <w:r>
+        <w:t xml:space="preserve"> ¥1</w:t>
+      </w:r>
+      <w:r>
+        <w:t>（牌价口径约</w:t>
+      </w:r>
+      <w:r>
+        <w:t xml:space="preserve"> ¥5</w:t>
+      </w:r>
+      <w:r>
+        <w:t>）。</w:t>
       </w:r>
     </w:p>
     <w:p>
@@ -39868,49 +40562,71 @@
           <w:b/>
           <w:bCs/>
         </w:rPr>
-        <w:t>失败驱动的困难实例生成</w:t>
-      </w:r>
-      <w:r>
-        <w:t>：迁移</w:t>
-      </w:r>
-      <w:r>
-        <w:t xml:space="preserve"> FuzzGPT </w:t>
-      </w:r>
-      <w:r>
-        <w:t>方法论</w:t>
+        <w:t>记录响应侧模型字段与账单档位</w:t>
+      </w:r>
+      <w:r>
+        <w:t>：本次对账暴露的别名漂移（请求</w:t>
+      </w:r>
+      <w:r>
+        <w:t xml:space="preserve"> deepseek-chat/qwen-plus</w:t>
+      </w:r>
+      <w:r>
+        <w:t>、计费</w:t>
+      </w:r>
+      <w:r>
+        <w:t xml:space="preserve"> deepseek-flash/qwen3.8-flash</w:t>
+      </w:r>
+      <w:r>
+        <w:t>，</w:t>
+      </w:r>
+      <w:r>
+        <w:t xml:space="preserve">3.3 </w:t>
+      </w:r>
+      <w:r>
+        <w:t>节）说明仅记录请求侧模型名不足以锁定被测对象</w:t>
       </w:r>
       <w:r>
         <w:t>——</w:t>
       </w:r>
       <w:r>
-        <w:t>以</w:t>
-      </w:r>
-      <w:r>
-        <w:t xml:space="preserve"> transcripts </w:t>
-      </w:r>
-      <w:r>
-        <w:t>中的历史失败样本为种子，引导</w:t>
-      </w:r>
-      <w:r>
-        <w:t xml:space="preserve"> LLM </w:t>
-      </w:r>
-      <w:r>
-        <w:t>生成同分布的更难实例</w:t>
-      </w:r>
-      <w:r>
-        <w:rPr>
-          <w:vertAlign w:val="superscript"/>
-        </w:rPr>
-        <w:t>[5]</w:t>
-      </w:r>
-      <w:r>
-        <w:t>；本体系的全量</w:t>
+        <w:t>后续版本将在</w:t>
       </w:r>
       <w:r>
         <w:t xml:space="preserve"> transcript </w:t>
       </w:r>
       <w:r>
-        <w:t>落盘为此保留了完整原料。</w:t>
+        <w:lastRenderedPageBreak/>
+        <w:t>中落盘响应的</w:t>
+      </w:r>
+      <w:r>
+        <w:t xml:space="preserve"> model </w:t>
+      </w:r>
+      <w:r>
+        <w:t>字段、</w:t>
+      </w:r>
+      <w:r>
+        <w:t xml:space="preserve">usage </w:t>
+      </w:r>
+      <w:r>
+        <w:t>中的缓存命中</w:t>
+      </w:r>
+      <w:r>
+        <w:t xml:space="preserve"> token </w:t>
+      </w:r>
+      <w:r>
+        <w:t>数，并在</w:t>
+      </w:r>
+      <w:r>
+        <w:t xml:space="preserve"> manifest </w:t>
+      </w:r>
+      <w:r>
+        <w:t>中登记账单计费档位，使成本口径可逐</w:t>
+      </w:r>
+      <w:r>
+        <w:t xml:space="preserve"> run </w:t>
+      </w:r>
+      <w:r>
+        <w:t>审计。</w:t>
       </w:r>
     </w:p>
     <w:p>
@@ -39927,40 +40643,49 @@
           <w:b/>
           <w:bCs/>
         </w:rPr>
-        <w:t>结构化反馈消融</w:t>
-      </w:r>
-      <w:r>
-        <w:t>：把验证器的违规描述升级为结构化修复提示（如</w:t>
-      </w:r>
-      <w:r>
-        <w:t>“</w:t>
-      </w:r>
-      <w:r>
-        <w:t>城市</w:t>
-      </w:r>
-      <w:r>
-        <w:t xml:space="preserve"> 37 </w:t>
-      </w:r>
-      <w:r>
-        <w:t>与</w:t>
-      </w:r>
-      <w:r>
-        <w:t xml:space="preserve"> 82 </w:t>
-      </w:r>
-      <w:r>
-        <w:t>重复，请交换</w:t>
-      </w:r>
-      <w:r>
-        <w:t>”</w:t>
-      </w:r>
-      <w:r>
-        <w:t>），检验</w:t>
-      </w:r>
-      <w:r>
-        <w:t xml:space="preserve"> F2 </w:t>
-      </w:r>
-      <w:r>
-        <w:t>主导失败对反馈粒度的敏感度。</w:t>
+        <w:t>失败驱动的困难实例生成</w:t>
+      </w:r>
+      <w:r>
+        <w:t>：迁移</w:t>
+      </w:r>
+      <w:r>
+        <w:t xml:space="preserve"> FuzzGPT </w:t>
+      </w:r>
+      <w:r>
+        <w:t>方法论</w:t>
+      </w:r>
+      <w:r>
+        <w:t>——</w:t>
+      </w:r>
+      <w:r>
+        <w:t>以</w:t>
+      </w:r>
+      <w:r>
+        <w:t xml:space="preserve"> transcripts </w:t>
+      </w:r>
+      <w:r>
+        <w:t>中的历史失败样本为种子，引导</w:t>
+      </w:r>
+      <w:r>
+        <w:t xml:space="preserve"> LLM </w:t>
+      </w:r>
+      <w:r>
+        <w:t>生成同分布的更难实例</w:t>
+      </w:r>
+      <w:r>
+        <w:rPr>
+          <w:vertAlign w:val="superscript"/>
+        </w:rPr>
+        <w:t>[5]</w:t>
+      </w:r>
+      <w:r>
+        <w:t>；本体系的全量</w:t>
+      </w:r>
+      <w:r>
+        <w:t xml:space="preserve"> transcript </w:t>
+      </w:r>
+      <w:r>
+        <w:t>落盘为此保留了完整原料。</w:t>
       </w:r>
     </w:p>
     <w:p>
@@ -39977,7 +40702,56 @@
           <w:b/>
           <w:bCs/>
         </w:rPr>
-        <w:lastRenderedPageBreak/>
+        <w:t>结构化反馈消融</w:t>
+      </w:r>
+      <w:r>
+        <w:t>：把验证器的违规描述升级为结构化修复提示（如</w:t>
+      </w:r>
+      <w:r>
+        <w:t>“</w:t>
+      </w:r>
+      <w:r>
+        <w:t>城市</w:t>
+      </w:r>
+      <w:r>
+        <w:t xml:space="preserve"> 37 </w:t>
+      </w:r>
+      <w:r>
+        <w:t>与</w:t>
+      </w:r>
+      <w:r>
+        <w:t xml:space="preserve"> 82 </w:t>
+      </w:r>
+      <w:r>
+        <w:t>重复，请交换</w:t>
+      </w:r>
+      <w:r>
+        <w:t>”</w:t>
+      </w:r>
+      <w:r>
+        <w:t>），检验</w:t>
+      </w:r>
+      <w:r>
+        <w:t xml:space="preserve"> F2 </w:t>
+      </w:r>
+      <w:r>
+        <w:t>主导失败对反馈粒度的敏感度。</w:t>
+      </w:r>
+    </w:p>
+    <w:p>
+      <w:pPr>
+        <w:pStyle w:val="a4"/>
+        <w:numPr>
+          <w:ilvl w:val="0"/>
+          <w:numId w:val="2"/>
+        </w:numPr>
+        <w:spacing w:line="360" w:lineRule="auto"/>
+      </w:pPr>
+      <w:r>
+        <w:rPr>
+          <w:b/>
+          <w:bCs/>
+        </w:rPr>
         <w:t>评测对象扩展</w:t>
       </w:r>
       <w:r>
@@ -40049,7 +40823,7 @@
         <w:pStyle w:val="1"/>
         <w:pageBreakBefore/>
       </w:pPr>
-      <w:bookmarkStart w:id="35" w:name="_Toc242176787"/>
+      <w:bookmarkStart w:id="35" w:name="_Toc242208896"/>
       <w:r>
         <w:lastRenderedPageBreak/>
         <w:t>7</w:t>
@@ -40113,13 +40887,13 @@
         <w:t xml:space="preserve">360 </w:t>
       </w:r>
       <w:r>
-        <w:t>次运行、约</w:t>
-      </w:r>
-      <w:r>
-        <w:t xml:space="preserve"> ¥4.4 </w:t>
-      </w:r>
-      <w:r>
-        <w:t>总成本的实验按预登记假设组织检验，产出四条有统计支撑的发现，其中一条预登记假设被证伪</w:t>
+        <w:t>次运行、账单实测总成本</w:t>
+      </w:r>
+      <w:r>
+        <w:t xml:space="preserve"> ¥2.59 </w:t>
+      </w:r>
+      <w:r>
+        <w:t>的实验按预登记假设组织检验，产出四条有统计支撑的发现，其中一条预登记假设被证伪</w:t>
       </w:r>
       <w:r>
         <w:t>——</w:t>
@@ -40144,10 +40918,16 @@
         <w:t>成本可以成为事前受控变量</w:t>
       </w:r>
       <w:r>
-        <w:t>（实际成本为预算估算的</w:t>
-      </w:r>
-      <w:r>
-        <w:t xml:space="preserve"> 1/5</w:t>
+        <w:t>（账单实测总成本</w:t>
+      </w:r>
+      <w:r>
+        <w:t xml:space="preserve"> ¥2.59</w:t>
+      </w:r>
+      <w:r>
+        <w:t>，为预算估算的约</w:t>
+      </w:r>
+      <w:r>
+        <w:t xml:space="preserve"> 1/8</w:t>
       </w:r>
       <w:r>
         <w:t>，熔断线远未触达），</w:t>
@@ -40232,16 +41012,34 @@
           <w:b/>
           <w:bCs/>
         </w:rPr>
-        <w:t>预算事前登记、熔断兜底</w:t>
-      </w:r>
-      <w:r>
-        <w:t>：在配置文件中声明三重上限并在运行时强制执行，而非事后记账。本实验实际成本为登记值的约</w:t>
-      </w:r>
-      <w:r>
-        <w:t xml:space="preserve"> 1/5</w:t>
-      </w:r>
-      <w:r>
-        <w:t>，但熔断线的意义在于让</w:t>
+        <w:t>预算事前登记、熔断兜底、账单对账</w:t>
+      </w:r>
+      <w:r>
+        <w:t>：在配置文件中声明三重上限并在运行时强制执行，而非事后记账。本实验账单实测成本为登记值的约</w:t>
+      </w:r>
+      <w:r>
+        <w:t xml:space="preserve"> 1/8</w:t>
+      </w:r>
+      <w:r>
+        <w:t>（</w:t>
+      </w:r>
+      <w:r>
+        <w:t>¥2.59 vs ¥20</w:t>
+      </w:r>
+      <w:r>
+        <w:t>）</w:t>
+      </w:r>
+      <w:r>
+        <w:t>——</w:t>
+      </w:r>
+      <w:r>
+        <w:t>且对账发现了计费档位漂移与缓存折扣（</w:t>
+      </w:r>
+      <w:r>
+        <w:t xml:space="preserve">3.3 </w:t>
+      </w:r>
+      <w:r>
+        <w:t>节），这类信息只有账单口径才能暴露；熔断线的意义在于让</w:t>
       </w:r>
       <w:r>
         <w:t>“</w:t>
@@ -40485,7 +41283,7 @@
         <w:pStyle w:val="1"/>
         <w:pageBreakBefore/>
       </w:pPr>
-      <w:bookmarkStart w:id="36" w:name="_Toc242176788"/>
+      <w:bookmarkStart w:id="36" w:name="_Toc242208897"/>
       <w:r>
         <w:lastRenderedPageBreak/>
         <w:t>参考文献</w:t>
@@ -40575,7 +41373,7 @@
         <w:pStyle w:val="1"/>
         <w:pageBreakBefore/>
       </w:pPr>
-      <w:bookmarkStart w:id="37" w:name="_Toc242176789"/>
+      <w:bookmarkStart w:id="37" w:name="_Toc242208898"/>
       <w:r>
         <w:lastRenderedPageBreak/>
         <w:t>附录</w:t>
@@ -41249,7 +42047,7 @@
         <w:pStyle w:val="1"/>
         <w:pageBreakBefore/>
       </w:pPr>
-      <w:bookmarkStart w:id="38" w:name="_Toc242176790"/>
+      <w:bookmarkStart w:id="38" w:name="_Toc242208899"/>
       <w:r>
         <w:lastRenderedPageBreak/>
         <w:t>附录</w:t>
@@ -41441,7 +42239,7 @@
           <w:left w:w="10" w:type="dxa"/>
           <w:right w:w="10" w:type="dxa"/>
         </w:tblCellMar>
-        <w:tblLook w:val="0000" w:firstRow="0" w:lastRow="0" w:firstColumn="0" w:lastColumn="0" w:noHBand="0" w:noVBand="0"/>
+        <w:tblLook w:val="04A0" w:firstRow="1" w:lastRow="0" w:firstColumn="1" w:lastColumn="0" w:noHBand="0" w:noVBand="1"/>
       </w:tblPr>
       <w:tblGrid>
         <w:gridCol w:w="1150"/>
@@ -57478,10 +58276,10 @@
 <file path=word/numbering.xml><?xml version="1.0" encoding="utf-8"?>
 <w:numbering xmlns:wpc="http://schemas.microsoft.com/office/word/2010/wordprocessingCanvas" xmlns:cx="http://schemas.microsoft.com/office/drawing/2014/chartex" xmlns:cx1="http://schemas.microsoft.com/office/drawing/2015/9/8/chartex" xmlns:cx2="http://schemas.microsoft.com/office/drawing/2015/10/21/chartex" xmlns:cx3="http://schemas.microsoft.com/office/drawing/2016/5/9/chartex" xmlns:cx4="http://schemas.microsoft.com/office/drawing/2016/5/10/chartex" xmlns:cx5="http://schemas.microsoft.com/office/drawing/2016/5/11/chartex" xmlns:cx6="http://schemas.microsoft.com/office/drawing/2016/5/12/chartex" xmlns:cx7="http://schemas.microsoft.com/office/drawing/2016/5/13/chartex" xmlns:cx8="http://schemas.microsoft.com/office/drawing/2016/5/14/chartex" xmlns:mc="http://schemas.openxmlformats.org/markup-compatibility/2006" xmlns:aink="http://schemas.microsoft.com/office/drawing/2016/ink" xmlns:am3d="http://schemas.microsoft.com/office/drawing/2017/model3d" xmlns:o="urn:schemas-microsoft-com:office:office" xmlns:oel="http://schemas.microsoft.com/office/2019/extlst" xmlns:r="http://schemas.openxmlformats.org/officeDocument/2006/relationships" xmlns:m="http://schemas.openxmlformats.org/officeDocument/2006/math" xmlns:v="urn:schemas-microsoft-com:vml" xmlns:wp14="http://schemas.microsoft.com/office/word/2010/wordprocessingDrawing" xmlns:wp="http://schemas.openxmlformats.org/drawingml/2006/wordprocessingDrawing" xmlns:w10="urn:schemas-microsoft-com:office:word" xmlns:w="http://schemas.openxmlformats.org/wordprocessingml/2006/main" xmlns:w14="http://schemas.microsoft.com/office/word/2010/wordml" xmlns:w15="http://schemas.microsoft.com/office/word/2012/wordml" xmlns:w16cex="http://schemas.microsoft.com/office/word/2018/wordml/cex" xmlns:w16cid="http://schemas.microsoft.com/office/word/2016/wordml/cid" xmlns:w16="http://schemas.microsoft.com/office/word/2018/wordml" xmlns:w16du="http://schemas.microsoft.com/office/word/2023/wordml/word16du" xmlns:w16sdtdh="http://schemas.microsoft.com/office/word/2020/wordml/sdtdatahash" xmlns:w16sdtfl="http://schemas.microsoft.com/office/word/2024/wordml/sdtformatlock" xmlns:w16se="http://schemas.microsoft.com/office/word/2015/wordml/symex" xmlns:wpg="http://schemas.microsoft.com/office/word/2010/wordprocessingGroup" xmlns:wpi="http://schemas.microsoft.com/office/word/2010/wordprocessingInk" xmlns:wne="http://schemas.microsoft.com/office/word/2006/wordml" xmlns:wps="http://schemas.microsoft.com/office/word/2010/wordprocessingShape" mc:Ignorable="w14 w15 w16se w16cid w16 w16cex w16sdtdh w16sdtfl w16du wp14">
   <w:abstractNum w:abstractNumId="0" w15:restartNumberingAfterBreak="0">
-    <w:nsid w:val="2F283BC7"/>
+    <w:nsid w:val="252D5EA6"/>
     <w:multiLevelType w:val="hybridMultilevel"/>
-    <w:tmpl w:val="28CC6A9C"/>
-    <w:lvl w:ilvl="0" w:tplc="3E12A8FC">
+    <w:tmpl w:val="81A4D794"/>
+    <w:lvl w:ilvl="0" w:tplc="DE6A1B56">
       <w:start w:val="1"/>
       <w:numFmt w:val="bullet"/>
       <w:lvlText w:val="•"/>
@@ -57490,52 +58288,52 @@
         <w:ind w:left="720" w:hanging="360"/>
       </w:pPr>
     </w:lvl>
-    <w:lvl w:ilvl="1" w:tplc="8020C782">
+    <w:lvl w:ilvl="1" w:tplc="337698D6">
       <w:numFmt w:val="decimal"/>
       <w:lvlText w:val=""/>
       <w:lvlJc w:val="left"/>
     </w:lvl>
-    <w:lvl w:ilvl="2" w:tplc="41BE9F72">
+    <w:lvl w:ilvl="2" w:tplc="D8B881F4">
       <w:numFmt w:val="decimal"/>
       <w:lvlText w:val=""/>
       <w:lvlJc w:val="left"/>
     </w:lvl>
-    <w:lvl w:ilvl="3" w:tplc="5CC6736A">
+    <w:lvl w:ilvl="3" w:tplc="EEBE885C">
       <w:numFmt w:val="decimal"/>
       <w:lvlText w:val=""/>
       <w:lvlJc w:val="left"/>
     </w:lvl>
-    <w:lvl w:ilvl="4" w:tplc="2A8A7F94">
+    <w:lvl w:ilvl="4" w:tplc="CD34BBDA">
       <w:numFmt w:val="decimal"/>
       <w:lvlText w:val=""/>
       <w:lvlJc w:val="left"/>
     </w:lvl>
-    <w:lvl w:ilvl="5" w:tplc="C6AEAFBE">
+    <w:lvl w:ilvl="5" w:tplc="3432D978">
       <w:numFmt w:val="decimal"/>
       <w:lvlText w:val=""/>
       <w:lvlJc w:val="left"/>
     </w:lvl>
-    <w:lvl w:ilvl="6" w:tplc="8CD68A96">
+    <w:lvl w:ilvl="6" w:tplc="80F83312">
       <w:numFmt w:val="decimal"/>
       <w:lvlText w:val=""/>
       <w:lvlJc w:val="left"/>
     </w:lvl>
-    <w:lvl w:ilvl="7" w:tplc="3ACC2D02">
+    <w:lvl w:ilvl="7" w:tplc="A50AF788">
       <w:numFmt w:val="decimal"/>
       <w:lvlText w:val=""/>
       <w:lvlJc w:val="left"/>
     </w:lvl>
-    <w:lvl w:ilvl="8" w:tplc="22C43F5E">
+    <w:lvl w:ilvl="8" w:tplc="B1CEACC4">
       <w:numFmt w:val="decimal"/>
       <w:lvlText w:val=""/>
       <w:lvlJc w:val="left"/>
     </w:lvl>
   </w:abstractNum>
   <w:abstractNum w:abstractNumId="1" w15:restartNumberingAfterBreak="0">
-    <w:nsid w:val="3F056BB6"/>
+    <w:nsid w:val="3A254B0C"/>
     <w:multiLevelType w:val="hybridMultilevel"/>
-    <w:tmpl w:val="DA5692DA"/>
-    <w:lvl w:ilvl="0" w:tplc="4E241F8C">
+    <w:tmpl w:val="88D2490C"/>
+    <w:lvl w:ilvl="0" w:tplc="C712A320">
       <w:start w:val="1"/>
       <w:numFmt w:val="decimal"/>
       <w:lvlText w:val="%1."/>
@@ -57544,106 +58342,52 @@
         <w:ind w:left="720" w:hanging="360"/>
       </w:pPr>
     </w:lvl>
-    <w:lvl w:ilvl="1" w:tplc="C2BE9716">
+    <w:lvl w:ilvl="1" w:tplc="762E2ADA">
       <w:numFmt w:val="decimal"/>
       <w:lvlText w:val=""/>
       <w:lvlJc w:val="left"/>
     </w:lvl>
-    <w:lvl w:ilvl="2" w:tplc="92FA0E80">
+    <w:lvl w:ilvl="2" w:tplc="3AEC0262">
       <w:numFmt w:val="decimal"/>
       <w:lvlText w:val=""/>
       <w:lvlJc w:val="left"/>
     </w:lvl>
-    <w:lvl w:ilvl="3" w:tplc="B088CA06">
+    <w:lvl w:ilvl="3" w:tplc="BC2A5050">
       <w:numFmt w:val="decimal"/>
       <w:lvlText w:val=""/>
       <w:lvlJc w:val="left"/>
     </w:lvl>
-    <w:lvl w:ilvl="4" w:tplc="F6C8F862">
+    <w:lvl w:ilvl="4" w:tplc="859ACD42">
       <w:numFmt w:val="decimal"/>
       <w:lvlText w:val=""/>
       <w:lvlJc w:val="left"/>
     </w:lvl>
-    <w:lvl w:ilvl="5" w:tplc="58FE6E26">
+    <w:lvl w:ilvl="5" w:tplc="F284477C">
       <w:numFmt w:val="decimal"/>
       <w:lvlText w:val=""/>
       <w:lvlJc w:val="left"/>
     </w:lvl>
-    <w:lvl w:ilvl="6" w:tplc="19FC4C04">
+    <w:lvl w:ilvl="6" w:tplc="E92CD01C">
       <w:numFmt w:val="decimal"/>
       <w:lvlText w:val=""/>
       <w:lvlJc w:val="left"/>
     </w:lvl>
-    <w:lvl w:ilvl="7" w:tplc="B4B048A0">
+    <w:lvl w:ilvl="7" w:tplc="6138FA12">
       <w:numFmt w:val="decimal"/>
       <w:lvlText w:val=""/>
       <w:lvlJc w:val="left"/>
     </w:lvl>
-    <w:lvl w:ilvl="8" w:tplc="B2947116">
+    <w:lvl w:ilvl="8" w:tplc="0A56D4F2">
       <w:numFmt w:val="decimal"/>
       <w:lvlText w:val=""/>
       <w:lvlJc w:val="left"/>
     </w:lvl>
   </w:abstractNum>
   <w:abstractNum w:abstractNumId="2" w15:restartNumberingAfterBreak="0">
-    <w:nsid w:val="597A7097"/>
+    <w:nsid w:val="500C2DA3"/>
     <w:multiLevelType w:val="hybridMultilevel"/>
-    <w:tmpl w:val="311671FE"/>
-    <w:lvl w:ilvl="0" w:tplc="BD3406E6">
-      <w:start w:val="1"/>
-      <w:numFmt w:val="decimal"/>
-      <w:lvlText w:val="%1."/>
-      <w:lvlJc w:val="left"/>
-      <w:pPr>
-        <w:ind w:left="720" w:hanging="360"/>
-      </w:pPr>
-    </w:lvl>
-    <w:lvl w:ilvl="1" w:tplc="1A34932C">
-      <w:numFmt w:val="decimal"/>
-      <w:lvlText w:val=""/>
-      <w:lvlJc w:val="left"/>
-    </w:lvl>
-    <w:lvl w:ilvl="2" w:tplc="7D9C54AC">
-      <w:numFmt w:val="decimal"/>
-      <w:lvlText w:val=""/>
-      <w:lvlJc w:val="left"/>
-    </w:lvl>
-    <w:lvl w:ilvl="3" w:tplc="A04E409A">
-      <w:numFmt w:val="decimal"/>
-      <w:lvlText w:val=""/>
-      <w:lvlJc w:val="left"/>
-    </w:lvl>
-    <w:lvl w:ilvl="4" w:tplc="BB042FCA">
-      <w:numFmt w:val="decimal"/>
-      <w:lvlText w:val=""/>
-      <w:lvlJc w:val="left"/>
-    </w:lvl>
-    <w:lvl w:ilvl="5" w:tplc="E6D8AC94">
-      <w:numFmt w:val="decimal"/>
-      <w:lvlText w:val=""/>
-      <w:lvlJc w:val="left"/>
-    </w:lvl>
-    <w:lvl w:ilvl="6" w:tplc="23167DA8">
-      <w:numFmt w:val="decimal"/>
-      <w:lvlText w:val=""/>
-      <w:lvlJc w:val="left"/>
-    </w:lvl>
-    <w:lvl w:ilvl="7" w:tplc="FAAC5CF8">
-      <w:numFmt w:val="decimal"/>
-      <w:lvlText w:val=""/>
-      <w:lvlJc w:val="left"/>
-    </w:lvl>
-    <w:lvl w:ilvl="8" w:tplc="EB522D5E">
-      <w:numFmt w:val="decimal"/>
-      <w:lvlText w:val=""/>
-      <w:lvlJc w:val="left"/>
-    </w:lvl>
-  </w:abstractNum>
-  <w:abstractNum w:abstractNumId="3" w15:restartNumberingAfterBreak="0">
-    <w:nsid w:val="5D777539"/>
-    <w:multiLevelType w:val="hybridMultilevel"/>
-    <w:tmpl w:val="9B5ECB60"/>
-    <w:lvl w:ilvl="0" w:tplc="A7A8695C" w:tentative="1">
+    <w:tmpl w:val="F962BE5E"/>
+    <w:lvl w:ilvl="0" w:tplc="B09004C6" w:tentative="1">
       <w:start w:val="1"/>
       <w:numFmt w:val="bullet"/>
       <w:lvlText w:val="●"/>
@@ -57652,7 +58396,7 @@
         <w:ind w:left="720" w:hanging="360"/>
       </w:pPr>
     </w:lvl>
-    <w:lvl w:ilvl="1" w:tplc="8522FEBE" w:tentative="1">
+    <w:lvl w:ilvl="1" w:tplc="6742EADC" w:tentative="1">
       <w:start w:val="1"/>
       <w:numFmt w:val="bullet"/>
       <w:lvlText w:val="○"/>
@@ -57661,7 +58405,7 @@
         <w:ind w:left="1440" w:hanging="360"/>
       </w:pPr>
     </w:lvl>
-    <w:lvl w:ilvl="2" w:tplc="767A950C" w:tentative="1">
+    <w:lvl w:ilvl="2" w:tplc="B68A64CA" w:tentative="1">
       <w:start w:val="1"/>
       <w:numFmt w:val="bullet"/>
       <w:lvlText w:val="■"/>
@@ -57670,7 +58414,7 @@
         <w:ind w:left="2160" w:hanging="360"/>
       </w:pPr>
     </w:lvl>
-    <w:lvl w:ilvl="3" w:tplc="561AA328" w:tentative="1">
+    <w:lvl w:ilvl="3" w:tplc="0F78B74C" w:tentative="1">
       <w:start w:val="1"/>
       <w:numFmt w:val="bullet"/>
       <w:lvlText w:val="●"/>
@@ -57679,7 +58423,7 @@
         <w:ind w:left="2880" w:hanging="360"/>
       </w:pPr>
     </w:lvl>
-    <w:lvl w:ilvl="4" w:tplc="C62C2F06" w:tentative="1">
+    <w:lvl w:ilvl="4" w:tplc="81784DB6" w:tentative="1">
       <w:start w:val="1"/>
       <w:numFmt w:val="bullet"/>
       <w:lvlText w:val="○"/>
@@ -57688,7 +58432,7 @@
         <w:ind w:left="3600" w:hanging="360"/>
       </w:pPr>
     </w:lvl>
-    <w:lvl w:ilvl="5" w:tplc="498E5D1C" w:tentative="1">
+    <w:lvl w:ilvl="5" w:tplc="9AC4CB92" w:tentative="1">
       <w:start w:val="1"/>
       <w:numFmt w:val="bullet"/>
       <w:lvlText w:val="■"/>
@@ -57697,7 +58441,7 @@
         <w:ind w:left="4320" w:hanging="360"/>
       </w:pPr>
     </w:lvl>
-    <w:lvl w:ilvl="6" w:tplc="658E5658" w:tentative="1">
+    <w:lvl w:ilvl="6" w:tplc="4E7A1A22" w:tentative="1">
       <w:start w:val="1"/>
       <w:numFmt w:val="bullet"/>
       <w:lvlText w:val="●"/>
@@ -57706,7 +58450,7 @@
         <w:ind w:left="5040" w:hanging="360"/>
       </w:pPr>
     </w:lvl>
-    <w:lvl w:ilvl="7" w:tplc="DC740610" w:tentative="1">
+    <w:lvl w:ilvl="7" w:tplc="068ED07A" w:tentative="1">
       <w:start w:val="1"/>
       <w:numFmt w:val="bullet"/>
       <w:lvlText w:val="●"/>
@@ -57715,7 +58459,7 @@
         <w:ind w:left="5760" w:hanging="360"/>
       </w:pPr>
     </w:lvl>
-    <w:lvl w:ilvl="8" w:tplc="E1A2AA5E" w:tentative="1">
+    <w:lvl w:ilvl="8" w:tplc="85A6D814" w:tentative="1">
       <w:start w:val="1"/>
       <w:numFmt w:val="bullet"/>
       <w:lvlText w:val="●"/>
@@ -57725,11 +58469,11 @@
       </w:pPr>
     </w:lvl>
   </w:abstractNum>
-  <w:abstractNum w:abstractNumId="4" w15:restartNumberingAfterBreak="0">
-    <w:nsid w:val="63AF79F5"/>
+  <w:abstractNum w:abstractNumId="3" w15:restartNumberingAfterBreak="0">
+    <w:nsid w:val="789E158A"/>
     <w:multiLevelType w:val="hybridMultilevel"/>
-    <w:tmpl w:val="EEC6CD9E"/>
-    <w:lvl w:ilvl="0" w:tplc="CDE0823C">
+    <w:tmpl w:val="EF342140"/>
+    <w:lvl w:ilvl="0" w:tplc="F6EA0E14">
       <w:start w:val="1"/>
       <w:numFmt w:val="decimal"/>
       <w:lvlText w:val="%1."/>
@@ -57738,73 +58482,127 @@
         <w:ind w:left="720" w:hanging="360"/>
       </w:pPr>
     </w:lvl>
-    <w:lvl w:ilvl="1" w:tplc="A6A0F1FE">
+    <w:lvl w:ilvl="1" w:tplc="58BC7E0A">
       <w:numFmt w:val="decimal"/>
       <w:lvlText w:val=""/>
       <w:lvlJc w:val="left"/>
     </w:lvl>
-    <w:lvl w:ilvl="2" w:tplc="4ACA973E">
+    <w:lvl w:ilvl="2" w:tplc="D2A6E9E0">
       <w:numFmt w:val="decimal"/>
       <w:lvlText w:val=""/>
       <w:lvlJc w:val="left"/>
     </w:lvl>
-    <w:lvl w:ilvl="3" w:tplc="B9A0D598">
+    <w:lvl w:ilvl="3" w:tplc="BEC0505E">
       <w:numFmt w:val="decimal"/>
       <w:lvlText w:val=""/>
       <w:lvlJc w:val="left"/>
     </w:lvl>
-    <w:lvl w:ilvl="4" w:tplc="E734625C">
+    <w:lvl w:ilvl="4" w:tplc="7A2EC7D6">
       <w:numFmt w:val="decimal"/>
       <w:lvlText w:val=""/>
       <w:lvlJc w:val="left"/>
     </w:lvl>
-    <w:lvl w:ilvl="5" w:tplc="B91CDE4A">
+    <w:lvl w:ilvl="5" w:tplc="FE6654C2">
       <w:numFmt w:val="decimal"/>
       <w:lvlText w:val=""/>
       <w:lvlJc w:val="left"/>
     </w:lvl>
-    <w:lvl w:ilvl="6" w:tplc="3BF477F8">
+    <w:lvl w:ilvl="6" w:tplc="F164207A">
       <w:numFmt w:val="decimal"/>
       <w:lvlText w:val=""/>
       <w:lvlJc w:val="left"/>
     </w:lvl>
-    <w:lvl w:ilvl="7" w:tplc="EDD0004E">
+    <w:lvl w:ilvl="7" w:tplc="6E308DE2">
       <w:numFmt w:val="decimal"/>
       <w:lvlText w:val=""/>
       <w:lvlJc w:val="left"/>
     </w:lvl>
-    <w:lvl w:ilvl="8" w:tplc="ECA64CF4">
+    <w:lvl w:ilvl="8" w:tplc="A2981922">
       <w:numFmt w:val="decimal"/>
       <w:lvlText w:val=""/>
       <w:lvlJc w:val="left"/>
     </w:lvl>
   </w:abstractNum>
-  <w:num w:numId="1" w16cid:durableId="684598561">
+  <w:abstractNum w:abstractNumId="4" w15:restartNumberingAfterBreak="0">
+    <w:nsid w:val="7B287B22"/>
+    <w:multiLevelType w:val="hybridMultilevel"/>
+    <w:tmpl w:val="3A0AEDC4"/>
+    <w:lvl w:ilvl="0" w:tplc="F8DA82AA">
+      <w:start w:val="1"/>
+      <w:numFmt w:val="decimal"/>
+      <w:lvlText w:val="%1."/>
+      <w:lvlJc w:val="left"/>
+      <w:pPr>
+        <w:ind w:left="720" w:hanging="360"/>
+      </w:pPr>
+    </w:lvl>
+    <w:lvl w:ilvl="1" w:tplc="1FA2F7C8">
+      <w:numFmt w:val="decimal"/>
+      <w:lvlText w:val=""/>
+      <w:lvlJc w:val="left"/>
+    </w:lvl>
+    <w:lvl w:ilvl="2" w:tplc="4FE0C582">
+      <w:numFmt w:val="decimal"/>
+      <w:lvlText w:val=""/>
+      <w:lvlJc w:val="left"/>
+    </w:lvl>
+    <w:lvl w:ilvl="3" w:tplc="9DA686EE">
+      <w:numFmt w:val="decimal"/>
+      <w:lvlText w:val=""/>
+      <w:lvlJc w:val="left"/>
+    </w:lvl>
+    <w:lvl w:ilvl="4" w:tplc="DB40E096">
+      <w:numFmt w:val="decimal"/>
+      <w:lvlText w:val=""/>
+      <w:lvlJc w:val="left"/>
+    </w:lvl>
+    <w:lvl w:ilvl="5" w:tplc="551C793A">
+      <w:numFmt w:val="decimal"/>
+      <w:lvlText w:val=""/>
+      <w:lvlJc w:val="left"/>
+    </w:lvl>
+    <w:lvl w:ilvl="6" w:tplc="19F666E2">
+      <w:numFmt w:val="decimal"/>
+      <w:lvlText w:val=""/>
+      <w:lvlJc w:val="left"/>
+    </w:lvl>
+    <w:lvl w:ilvl="7" w:tplc="56E4E7E2">
+      <w:numFmt w:val="decimal"/>
+      <w:lvlText w:val=""/>
+      <w:lvlJc w:val="left"/>
+    </w:lvl>
+    <w:lvl w:ilvl="8" w:tplc="4AB69D1E">
+      <w:numFmt w:val="decimal"/>
+      <w:lvlText w:val=""/>
+      <w:lvlJc w:val="left"/>
+    </w:lvl>
+  </w:abstractNum>
+  <w:num w:numId="1" w16cid:durableId="1859467587">
+    <w:abstractNumId w:val="2"/>
+    <w:lvlOverride w:ilvl="0">
+      <w:startOverride w:val="1"/>
+    </w:lvlOverride>
+  </w:num>
+  <w:num w:numId="2" w16cid:durableId="242180946">
+    <w:abstractNumId w:val="0"/>
+    <w:lvlOverride w:ilvl="0">
+      <w:startOverride w:val="1"/>
+    </w:lvlOverride>
+  </w:num>
+  <w:num w:numId="3" w16cid:durableId="530647168">
     <w:abstractNumId w:val="3"/>
     <w:lvlOverride w:ilvl="0">
       <w:startOverride w:val="1"/>
     </w:lvlOverride>
   </w:num>
-  <w:num w:numId="2" w16cid:durableId="1459178939">
-    <w:abstractNumId w:val="0"/>
+  <w:num w:numId="4" w16cid:durableId="1756392521">
+    <w:abstractNumId w:val="1"/>
     <w:lvlOverride w:ilvl="0">
       <w:startOverride w:val="1"/>
     </w:lvlOverride>
   </w:num>
-  <w:num w:numId="3" w16cid:durableId="1870751296">
-    <w:abstractNumId w:val="2"/>
-    <w:lvlOverride w:ilvl="0">
-      <w:startOverride w:val="1"/>
-    </w:lvlOverride>
-  </w:num>
-  <w:num w:numId="4" w16cid:durableId="1597134377">
+  <w:num w:numId="5" w16cid:durableId="1103695625">
     <w:abstractNumId w:val="4"/>
-    <w:lvlOverride w:ilvl="0">
-      <w:startOverride w:val="1"/>
-    </w:lvlOverride>
-  </w:num>
-  <w:num w:numId="5" w16cid:durableId="1641500168">
-    <w:abstractNumId w:val="1"/>
     <w:lvlOverride w:ilvl="0">
       <w:startOverride w:val="1"/>
     </w:lvlOverride>
@@ -58445,7 +59243,7 @@
     <w:autoRedefine/>
     <w:uiPriority w:val="39"/>
     <w:unhideWhenUsed/>
-    <w:rsid w:val="004B5A9F"/>
+    <w:rsid w:val="00C8524A"/>
   </w:style>
   <w:style w:type="paragraph" w:styleId="TOC2">
     <w:name w:val="toc 2"/>
@@ -58454,7 +59252,7 @@
     <w:autoRedefine/>
     <w:uiPriority w:val="39"/>
     <w:unhideWhenUsed/>
-    <w:rsid w:val="004B5A9F"/>
+    <w:rsid w:val="00C8524A"/>
     <w:pPr>
       <w:ind w:leftChars="200" w:left="420"/>
     </w:pPr>
@@ -58465,7 +59263,7 @@
     <w:link w:val="ad"/>
     <w:uiPriority w:val="99"/>
     <w:unhideWhenUsed/>
-    <w:rsid w:val="004B5A9F"/>
+    <w:rsid w:val="00C8524A"/>
     <w:pPr>
       <w:tabs>
         <w:tab w:val="center" w:pos="4153"/>
@@ -58484,7 +59282,7 @@
     <w:basedOn w:val="a0"/>
     <w:link w:val="ac"/>
     <w:uiPriority w:val="99"/>
-    <w:rsid w:val="004B5A9F"/>
+    <w:rsid w:val="00C8524A"/>
     <w:rPr>
       <w:sz w:val="18"/>
       <w:szCs w:val="18"/>
@@ -58496,7 +59294,7 @@
     <w:link w:val="af"/>
     <w:uiPriority w:val="99"/>
     <w:unhideWhenUsed/>
-    <w:rsid w:val="004B5A9F"/>
+    <w:rsid w:val="00C8524A"/>
     <w:pPr>
       <w:tabs>
         <w:tab w:val="center" w:pos="4153"/>
@@ -58514,7 +59312,7 @@
     <w:basedOn w:val="a0"/>
     <w:link w:val="ae"/>
     <w:uiPriority w:val="99"/>
-    <w:rsid w:val="004B5A9F"/>
+    <w:rsid w:val="00C8524A"/>
     <w:rPr>
       <w:sz w:val="18"/>
       <w:szCs w:val="18"/>

</xml_diff>